<commit_message>
Se sube reflexión individual
</commit_message>
<xml_diff>
--- a/Fase 2/Evidencias Individuales/Rodriguez_Mariana_2.1_APT122_DiarioReflexionFase2.docx
+++ b/Fase 2/Evidencias Individuales/Rodriguez_Mariana_2.1_APT122_DiarioReflexionFase2.docx
@@ -1,6 +1,6 @@
 
 <file path=word/document.xml><?xml version="1.0" encoding="utf-8"?>
-<w:document xmlns:wpc="http://schemas.microsoft.com/office/word/2010/wordprocessingCanvas" xmlns:cx="http://schemas.microsoft.com/office/drawing/2014/chartex" xmlns:mc="http://schemas.openxmlformats.org/markup-compatibility/2006" xmlns:o="urn:schemas-microsoft-com:office:office" xmlns:r="http://schemas.openxmlformats.org/officeDocument/2006/relationships" xmlns:m="http://schemas.openxmlformats.org/officeDocument/2006/math" xmlns:v="urn:schemas-microsoft-com:vml" xmlns:wp14="http://schemas.microsoft.com/office/word/2010/wordprocessingDrawing" xmlns:wp="http://schemas.openxmlformats.org/drawingml/2006/wordprocessingDrawing" xmlns:w10="urn:schemas-microsoft-com:office:word" xmlns:w="http://schemas.openxmlformats.org/wordprocessingml/2006/main" xmlns:w14="http://schemas.microsoft.com/office/word/2010/wordml" xmlns:w15="http://schemas.microsoft.com/office/word/2012/wordml" xmlns:w16se="http://schemas.microsoft.com/office/word/2015/wordml/symex" xmlns:wpg="http://schemas.microsoft.com/office/word/2010/wordprocessingGroup" xmlns:wpi="http://schemas.microsoft.com/office/word/2010/wordprocessingInk" xmlns:wne="http://schemas.microsoft.com/office/word/2006/wordml" xmlns:wps="http://schemas.microsoft.com/office/word/2010/wordprocessingShape" mc:Ignorable="w14 w15 w16se wp14">
+<w:document xmlns:wpc="http://schemas.microsoft.com/office/word/2010/wordprocessingCanvas" xmlns:cx="http://schemas.microsoft.com/office/drawing/2014/chartex" xmlns:cx1="http://schemas.microsoft.com/office/drawing/2015/9/8/chartex" xmlns:cx2="http://schemas.microsoft.com/office/drawing/2015/10/21/chartex" xmlns:cx3="http://schemas.microsoft.com/office/drawing/2016/5/9/chartex" xmlns:cx4="http://schemas.microsoft.com/office/drawing/2016/5/10/chartex" xmlns:cx5="http://schemas.microsoft.com/office/drawing/2016/5/11/chartex" xmlns:cx6="http://schemas.microsoft.com/office/drawing/2016/5/12/chartex" xmlns:cx7="http://schemas.microsoft.com/office/drawing/2016/5/13/chartex" xmlns:cx8="http://schemas.microsoft.com/office/drawing/2016/5/14/chartex" xmlns:mc="http://schemas.openxmlformats.org/markup-compatibility/2006" xmlns:aink="http://schemas.microsoft.com/office/drawing/2016/ink" xmlns:am3d="http://schemas.microsoft.com/office/drawing/2017/model3d" xmlns:o="urn:schemas-microsoft-com:office:office" xmlns:oel="http://schemas.microsoft.com/office/2019/extlst" xmlns:r="http://schemas.openxmlformats.org/officeDocument/2006/relationships" xmlns:m="http://schemas.openxmlformats.org/officeDocument/2006/math" xmlns:v="urn:schemas-microsoft-com:vml" xmlns:wp14="http://schemas.microsoft.com/office/word/2010/wordprocessingDrawing" xmlns:wp="http://schemas.openxmlformats.org/drawingml/2006/wordprocessingDrawing" xmlns:w10="urn:schemas-microsoft-com:office:word" xmlns:w="http://schemas.openxmlformats.org/wordprocessingml/2006/main" xmlns:w14="http://schemas.microsoft.com/office/word/2010/wordml" xmlns:w15="http://schemas.microsoft.com/office/word/2012/wordml" xmlns:w16cex="http://schemas.microsoft.com/office/word/2018/wordml/cex" xmlns:w16cid="http://schemas.microsoft.com/office/word/2016/wordml/cid" xmlns:w16="http://schemas.microsoft.com/office/word/2018/wordml" xmlns:w16du="http://schemas.microsoft.com/office/word/2023/wordml/word16du" xmlns:w16sdtdh="http://schemas.microsoft.com/office/word/2020/wordml/sdtdatahash" xmlns:w16sdtfl="http://schemas.microsoft.com/office/word/2024/wordml/sdtformatlock" xmlns:w16se="http://schemas.microsoft.com/office/word/2015/wordml/symex" xmlns:wpg="http://schemas.microsoft.com/office/word/2010/wordprocessingGroup" xmlns:wpi="http://schemas.microsoft.com/office/word/2010/wordprocessingInk" xmlns:wne="http://schemas.microsoft.com/office/word/2006/wordml" xmlns:wps="http://schemas.microsoft.com/office/word/2010/wordprocessingShape" mc:Ignorable="w14 w15 w16se w16cid w16 w16cex w16sdtdh w16sdtfl w16du wp14">
   <w:body>
     <w:p/>
     <w:tbl>
@@ -286,7 +286,25 @@
                 <w:sz w:val="24"/>
                 <w:szCs w:val="24"/>
               </w:rPr>
-              <w:t>1. Mira tu carta Gantt y reflexiona sobre los avances de tu Proyecto APT</w:t>
+              <w:t xml:space="preserve">1. Mira </w:t>
+            </w:r>
+            <w:proofErr w:type="spellStart"/>
+            <w:r>
+              <w:rPr>
+                <w:rFonts w:eastAsiaTheme="majorEastAsia"/>
+                <w:sz w:val="24"/>
+                <w:szCs w:val="24"/>
+              </w:rPr>
+              <w:t>tu</w:t>
+            </w:r>
+            <w:proofErr w:type="spellEnd"/>
+            <w:r>
+              <w:rPr>
+                <w:rFonts w:eastAsiaTheme="majorEastAsia"/>
+                <w:sz w:val="24"/>
+                <w:szCs w:val="24"/>
+              </w:rPr>
+              <w:t xml:space="preserve"> carta Gantt y reflexiona sobre los avances de tu Proyecto APT</w:t>
             </w:r>
           </w:p>
         </w:tc>
@@ -335,10 +353,97 @@
             <w:pPr>
               <w:jc w:val="both"/>
               <w:rPr>
-                <w:rFonts w:ascii="Calibri" w:hAnsi="Calibri"/>
-                <w:b/>
-                <w:bCs/>
-                <w:color w:val="1F4E79" w:themeColor="accent1" w:themeShade="80"/>
+                <w:rFonts w:eastAsiaTheme="majorEastAsia"/>
+                <w:sz w:val="24"/>
+                <w:szCs w:val="24"/>
+              </w:rPr>
+            </w:pPr>
+            <w:r>
+              <w:rPr>
+                <w:rFonts w:eastAsiaTheme="majorEastAsia"/>
+                <w:sz w:val="24"/>
+                <w:szCs w:val="24"/>
+              </w:rPr>
+              <w:t xml:space="preserve">Al revisar la carta Gantt, puedo decir que, como equipo, hemos cumplido con los tiempos y entregables planificados hasta el momento. Uno de los factores que ha facilitado este proceso ha sido la comunicación constante entre los integrantes, junto con la metodología ágil Scrum que escogimos para organizarnos. A través de ceremonias </w:t>
+            </w:r>
+            <w:r>
+              <w:rPr>
+                <w:rFonts w:eastAsiaTheme="majorEastAsia"/>
+                <w:sz w:val="24"/>
+                <w:szCs w:val="24"/>
+              </w:rPr>
+              <w:t xml:space="preserve">como el Sprint </w:t>
+            </w:r>
+            <w:proofErr w:type="spellStart"/>
+            <w:r>
+              <w:rPr>
+                <w:rFonts w:eastAsiaTheme="majorEastAsia"/>
+                <w:sz w:val="24"/>
+                <w:szCs w:val="24"/>
+              </w:rPr>
+              <w:t>Planning</w:t>
+            </w:r>
+            <w:proofErr w:type="spellEnd"/>
+            <w:r>
+              <w:rPr>
+                <w:rFonts w:eastAsiaTheme="majorEastAsia"/>
+                <w:sz w:val="24"/>
+                <w:szCs w:val="24"/>
+              </w:rPr>
+              <w:t xml:space="preserve"> y el Sprint </w:t>
+            </w:r>
+            <w:proofErr w:type="spellStart"/>
+            <w:r>
+              <w:rPr>
+                <w:rFonts w:eastAsiaTheme="majorEastAsia"/>
+                <w:sz w:val="24"/>
+                <w:szCs w:val="24"/>
+              </w:rPr>
+              <w:t>Review</w:t>
+            </w:r>
+            <w:proofErr w:type="spellEnd"/>
+            <w:r>
+              <w:rPr>
+                <w:rFonts w:eastAsiaTheme="majorEastAsia"/>
+                <w:sz w:val="24"/>
+                <w:szCs w:val="24"/>
+              </w:rPr>
+              <w:t>, y</w:t>
+            </w:r>
+            <w:r>
+              <w:rPr>
+                <w:rFonts w:eastAsiaTheme="majorEastAsia"/>
+                <w:sz w:val="24"/>
+                <w:szCs w:val="24"/>
+              </w:rPr>
+              <w:t xml:space="preserve"> el uso de </w:t>
+            </w:r>
+            <w:proofErr w:type="spellStart"/>
+            <w:r>
+              <w:rPr>
+                <w:rFonts w:eastAsiaTheme="majorEastAsia"/>
+                <w:sz w:val="24"/>
+                <w:szCs w:val="24"/>
+              </w:rPr>
+              <w:t>ClickUp</w:t>
+            </w:r>
+            <w:proofErr w:type="spellEnd"/>
+            <w:r>
+              <w:rPr>
+                <w:rFonts w:eastAsiaTheme="majorEastAsia"/>
+                <w:sz w:val="24"/>
+                <w:szCs w:val="24"/>
+              </w:rPr>
+              <w:t xml:space="preserve"> para gestionar nuestro backlog, asignar tareas y definir responsabilidades, hemos logrado mantener una buena organización y distribuir el trabajo de acuerdo con nuestras capacidades.</w:t>
+            </w:r>
+          </w:p>
+          <w:p>
+            <w:pPr>
+              <w:jc w:val="both"/>
+              <w:rPr>
+                <w:rFonts w:eastAsiaTheme="majorEastAsia"/>
+                <w:sz w:val="24"/>
+                <w:szCs w:val="24"/>
               </w:rPr>
             </w:pPr>
           </w:p>
@@ -346,10 +451,27 @@
             <w:pPr>
               <w:jc w:val="both"/>
               <w:rPr>
-                <w:rFonts w:ascii="Calibri" w:hAnsi="Calibri"/>
-                <w:b/>
-                <w:bCs/>
-                <w:color w:val="1F4E79" w:themeColor="accent1" w:themeShade="80"/>
+                <w:rFonts w:eastAsiaTheme="majorEastAsia"/>
+                <w:sz w:val="24"/>
+                <w:szCs w:val="24"/>
+              </w:rPr>
+            </w:pPr>
+            <w:r>
+              <w:rPr>
+                <w:rFonts w:eastAsiaTheme="majorEastAsia"/>
+                <w:sz w:val="24"/>
+                <w:szCs w:val="24"/>
+              </w:rPr>
+              <w:t>En cuanto a las dificultades, no hemos tenido grandes obstáculos, aunque algunas tareas no se han podido completar dentro del sprint correspondiente. En esos casos, las dividimos en componentes más pequeños y trasladamos lo pendiente al siguiente sprint. Esto nos ha permitido trabajar de manera flexible y adaptarnos a las necesidades del proyecto. Además, asignar las tareas considerando las habilidades y la experiencia de cada integrante nos ha ayudado a avanzar de forma más eficiente.</w:t>
+            </w:r>
+          </w:p>
+          <w:p>
+            <w:pPr>
+              <w:jc w:val="both"/>
+              <w:rPr>
+                <w:rFonts w:eastAsiaTheme="majorEastAsia"/>
+                <w:sz w:val="24"/>
+                <w:szCs w:val="24"/>
               </w:rPr>
             </w:pPr>
           </w:p>
@@ -357,6 +479,35 @@
             <w:pPr>
               <w:jc w:val="both"/>
               <w:rPr>
+                <w:rFonts w:eastAsiaTheme="majorEastAsia"/>
+                <w:sz w:val="24"/>
+                <w:szCs w:val="24"/>
+              </w:rPr>
+            </w:pPr>
+            <w:r>
+              <w:rPr>
+                <w:rFonts w:eastAsiaTheme="majorEastAsia"/>
+                <w:sz w:val="24"/>
+                <w:szCs w:val="24"/>
+              </w:rPr>
+              <w:t>En general, considero que la comunicación, la organización y la capacidad de adaptación han sido fundamentales para cumplir con nuestro plan de trabajo.</w:t>
+            </w:r>
+          </w:p>
+          <w:p>
+            <w:pPr>
+              <w:jc w:val="both"/>
+              <w:rPr>
+                <w:rFonts w:ascii="Calibri" w:hAnsi="Calibri"/>
+                <w:b/>
+                <w:bCs/>
+                <w:color w:val="1F4E79" w:themeColor="accent1" w:themeShade="80"/>
+              </w:rPr>
+            </w:pPr>
+          </w:p>
+          <w:p>
+            <w:pPr>
+              <w:jc w:val="both"/>
+              <w:rPr>
                 <w:rFonts w:ascii="Calibri" w:hAnsi="Calibri"/>
                 <w:b/>
                 <w:bCs/>
@@ -367,6 +518,54 @@
         </w:tc>
       </w:tr>
     </w:tbl>
+    <w:p>
+      <w:pPr>
+        <w:spacing w:after="0" w:line="360" w:lineRule="auto"/>
+        <w:jc w:val="both"/>
+        <w:rPr>
+          <w:color w:val="595959" w:themeColor="text1" w:themeTint="A6"/>
+          <w:sz w:val="24"/>
+          <w:szCs w:val="24"/>
+          <w:lang w:eastAsia="ja-JP"/>
+        </w:rPr>
+      </w:pPr>
+    </w:p>
+    <w:p>
+      <w:pPr>
+        <w:spacing w:after="0" w:line="360" w:lineRule="auto"/>
+        <w:jc w:val="both"/>
+        <w:rPr>
+          <w:color w:val="595959" w:themeColor="text1" w:themeTint="A6"/>
+          <w:sz w:val="24"/>
+          <w:szCs w:val="24"/>
+          <w:lang w:eastAsia="ja-JP"/>
+        </w:rPr>
+      </w:pPr>
+    </w:p>
+    <w:p>
+      <w:pPr>
+        <w:spacing w:after="0" w:line="360" w:lineRule="auto"/>
+        <w:jc w:val="both"/>
+        <w:rPr>
+          <w:color w:val="595959" w:themeColor="text1" w:themeTint="A6"/>
+          <w:sz w:val="24"/>
+          <w:szCs w:val="24"/>
+          <w:lang w:eastAsia="ja-JP"/>
+        </w:rPr>
+      </w:pPr>
+    </w:p>
+    <w:p>
+      <w:pPr>
+        <w:spacing w:after="0" w:line="360" w:lineRule="auto"/>
+        <w:jc w:val="both"/>
+        <w:rPr>
+          <w:color w:val="595959" w:themeColor="text1" w:themeTint="A6"/>
+          <w:sz w:val="24"/>
+          <w:szCs w:val="24"/>
+          <w:lang w:eastAsia="ja-JP"/>
+        </w:rPr>
+      </w:pPr>
+    </w:p>
     <w:p>
       <w:pPr>
         <w:spacing w:after="0" w:line="360" w:lineRule="auto"/>
@@ -422,6 +621,7 @@
                 <w:sz w:val="24"/>
                 <w:szCs w:val="24"/>
               </w:rPr>
+              <w:lastRenderedPageBreak/>
               <w:t xml:space="preserve">2. </w:t>
             </w:r>
           </w:p>
@@ -472,9 +672,20 @@
               <w:jc w:val="both"/>
               <w:rPr>
                 <w:rFonts w:ascii="Calibri" w:hAnsi="Calibri"/>
-                <w:b/>
-                <w:bCs/>
-                <w:color w:val="1F4E79" w:themeColor="accent1" w:themeShade="80"/>
+              </w:rPr>
+            </w:pPr>
+            <w:r>
+              <w:rPr>
+                <w:rFonts w:ascii="Calibri" w:hAnsi="Calibri"/>
+              </w:rPr>
+              <w:t>Como he mencionado anteriormente, no hemos enfrentado grandes dificultades en el desarrollo del proyecto. Sin embargo, en algunas ocasiones, el tiempo disponible no ha sido suficiente para completar ciertas tareas, ya sea por responsabilidades laborales, situaciones personales o falta de motivación. Hay días en los que cuesta más encontrar la energía para avanzar, y eso también forma parte del proceso.</w:t>
+            </w:r>
+          </w:p>
+          <w:p>
+            <w:pPr>
+              <w:jc w:val="both"/>
+              <w:rPr>
+                <w:rFonts w:ascii="Calibri" w:hAnsi="Calibri"/>
               </w:rPr>
             </w:pPr>
           </w:p>
@@ -483,6 +694,20 @@
               <w:jc w:val="both"/>
               <w:rPr>
                 <w:rFonts w:ascii="Calibri" w:hAnsi="Calibri"/>
+              </w:rPr>
+            </w:pPr>
+            <w:r>
+              <w:rPr>
+                <w:rFonts w:ascii="Calibri" w:hAnsi="Calibri"/>
+              </w:rPr>
+              <w:t>Para enfrentar estas situaciones, he procurado mantener una comunicación abierta con mi equipo, comentando las dificultades y asumiendo el compromiso de terminar las actividades pendientes durante el siguiente sprint. Creo que ser transparentes con nuestros avances y responsabilidades nos ha permitido reorganizarnos y seguir progresando sin perder de vista los objetivos del proyecto.</w:t>
+            </w:r>
+          </w:p>
+          <w:p>
+            <w:pPr>
+              <w:jc w:val="both"/>
+              <w:rPr>
+                <w:rFonts w:ascii="Calibri" w:hAnsi="Calibri"/>
                 <w:b/>
                 <w:bCs/>
                 <w:color w:val="1F4E79" w:themeColor="accent1" w:themeShade="80"/>
@@ -503,90 +728,6 @@
         </w:tc>
       </w:tr>
     </w:tbl>
-    <w:p>
-      <w:pPr>
-        <w:spacing w:after="0" w:line="360" w:lineRule="auto"/>
-        <w:jc w:val="both"/>
-        <w:rPr>
-          <w:color w:val="595959" w:themeColor="text1" w:themeTint="A6"/>
-          <w:sz w:val="24"/>
-          <w:szCs w:val="24"/>
-          <w:lang w:eastAsia="ja-JP"/>
-        </w:rPr>
-      </w:pPr>
-    </w:p>
-    <w:p>
-      <w:pPr>
-        <w:spacing w:after="0" w:line="360" w:lineRule="auto"/>
-        <w:jc w:val="both"/>
-        <w:rPr>
-          <w:b/>
-          <w:bCs/>
-          <w:sz w:val="24"/>
-          <w:szCs w:val="24"/>
-        </w:rPr>
-      </w:pPr>
-    </w:p>
-    <w:p>
-      <w:pPr>
-        <w:spacing w:after="0" w:line="360" w:lineRule="auto"/>
-        <w:jc w:val="both"/>
-        <w:rPr>
-          <w:b/>
-          <w:bCs/>
-          <w:sz w:val="24"/>
-          <w:szCs w:val="24"/>
-        </w:rPr>
-      </w:pPr>
-    </w:p>
-    <w:p>
-      <w:pPr>
-        <w:spacing w:after="0" w:line="360" w:lineRule="auto"/>
-        <w:jc w:val="both"/>
-        <w:rPr>
-          <w:b/>
-          <w:bCs/>
-          <w:sz w:val="24"/>
-          <w:szCs w:val="24"/>
-        </w:rPr>
-      </w:pPr>
-    </w:p>
-    <w:p>
-      <w:pPr>
-        <w:spacing w:after="0" w:line="360" w:lineRule="auto"/>
-        <w:jc w:val="both"/>
-        <w:rPr>
-          <w:b/>
-          <w:bCs/>
-          <w:sz w:val="24"/>
-          <w:szCs w:val="24"/>
-        </w:rPr>
-      </w:pPr>
-    </w:p>
-    <w:p>
-      <w:pPr>
-        <w:spacing w:after="0" w:line="360" w:lineRule="auto"/>
-        <w:jc w:val="both"/>
-        <w:rPr>
-          <w:b/>
-          <w:bCs/>
-          <w:sz w:val="24"/>
-          <w:szCs w:val="24"/>
-        </w:rPr>
-      </w:pPr>
-    </w:p>
-    <w:p>
-      <w:pPr>
-        <w:spacing w:after="0" w:line="360" w:lineRule="auto"/>
-        <w:jc w:val="both"/>
-        <w:rPr>
-          <w:b/>
-          <w:bCs/>
-          <w:sz w:val="24"/>
-          <w:szCs w:val="24"/>
-        </w:rPr>
-      </w:pPr>
-    </w:p>
     <w:p>
       <w:pPr>
         <w:spacing w:after="0" w:line="360" w:lineRule="auto"/>
@@ -685,7 +826,6 @@
                 <w:sz w:val="24"/>
                 <w:szCs w:val="24"/>
               </w:rPr>
-              <w:lastRenderedPageBreak/>
               <w:t>¿Cómo evalúas tu</w:t>
             </w:r>
             <w:r>
@@ -737,11 +877,62 @@
               <w:jc w:val="both"/>
               <w:rPr>
                 <w:rFonts w:ascii="Calibri" w:hAnsi="Calibri"/>
-                <w:b/>
-                <w:bCs/>
-                <w:color w:val="1F4E79" w:themeColor="accent1" w:themeShade="80"/>
               </w:rPr>
             </w:pPr>
+            <w:r>
+              <w:rPr>
+                <w:rFonts w:ascii="Calibri" w:hAnsi="Calibri"/>
+              </w:rPr>
+              <w:t>Evalúo mi trabajo de manera positiva, ya que considero que he sido responsable y comprometid</w:t>
+            </w:r>
+            <w:r>
+              <w:rPr>
+                <w:rFonts w:ascii="Calibri" w:hAnsi="Calibri"/>
+              </w:rPr>
+              <w:t>a</w:t>
+            </w:r>
+            <w:r>
+              <w:rPr>
+                <w:rFonts w:ascii="Calibri" w:hAnsi="Calibri"/>
+              </w:rPr>
+              <w:t xml:space="preserve"> con el desarrollo del proyecto. Destaco mi capacidad para organizar, mantener las cosas claras y buscar una buena distribución de las tareas, lo que también me motivó a asumir el rol de Scrum </w:t>
+            </w:r>
+            <w:proofErr w:type="gramStart"/>
+            <w:r>
+              <w:rPr>
+                <w:rFonts w:ascii="Calibri" w:hAnsi="Calibri"/>
+              </w:rPr>
+              <w:t>Master</w:t>
+            </w:r>
+            <w:proofErr w:type="gramEnd"/>
+            <w:r>
+              <w:rPr>
+                <w:rFonts w:ascii="Calibri" w:hAnsi="Calibri"/>
+              </w:rPr>
+              <w:t>. Desde este rol, me encargo de guiar al equipo, coordinar las actividades y procurar que los objetivos definidos sean realistas y alcanzables dentro de los tiempos establecidos.</w:t>
+            </w:r>
+          </w:p>
+          <w:p>
+            <w:pPr>
+              <w:jc w:val="both"/>
+              <w:rPr>
+                <w:rFonts w:ascii="Calibri" w:hAnsi="Calibri"/>
+              </w:rPr>
+            </w:pPr>
+          </w:p>
+          <w:p>
+            <w:pPr>
+              <w:jc w:val="both"/>
+              <w:rPr>
+                <w:rFonts w:ascii="Calibri" w:hAnsi="Calibri"/>
+              </w:rPr>
+            </w:pPr>
+            <w:r>
+              <w:rPr>
+                <w:rFonts w:ascii="Calibri" w:hAnsi="Calibri"/>
+              </w:rPr>
+              <w:t>Como aspecto a mejorar, creo que podría seguir desarrollando mis habilidades de liderazgo, especialmente en la forma de motivar al equipo y enfrentar los momentos en que el ritmo de trabajo disminuye. También me gustaría mejorar mi capacidad para anticipar posibles dificultades y encontrar soluciones antes de que afecten el avance del proyecto.</w:t>
+            </w:r>
           </w:p>
           <w:p>
             <w:pPr>
@@ -879,17 +1070,12 @@
                 <w:color w:val="1F4E79" w:themeColor="accent1" w:themeShade="80"/>
               </w:rPr>
             </w:pPr>
-          </w:p>
-          <w:p>
-            <w:pPr>
-              <w:jc w:val="both"/>
+            <w:r>
               <w:rPr>
                 <w:rFonts w:ascii="Calibri" w:hAnsi="Calibri"/>
-                <w:b/>
-                <w:bCs/>
-                <w:color w:val="1F4E79" w:themeColor="accent1" w:themeShade="80"/>
-              </w:rPr>
-            </w:pPr>
+              </w:rPr>
+              <w:t>Por el momento, no tengo inquietudes respecto a cómo proceder con el proyecto, ya que considero que tenemos claridad sobre los pasos a seguir y cómo organizarnos como equipo.</w:t>
+            </w:r>
           </w:p>
           <w:p>
             <w:pPr>
@@ -1033,7 +1219,24 @@
               <w:jc w:val="both"/>
               <w:rPr>
                 <w:rFonts w:eastAsiaTheme="majorEastAsia"/>
-                <w:color w:val="767171" w:themeColor="background2" w:themeShade="80"/>
+                <w:sz w:val="24"/>
+                <w:szCs w:val="24"/>
+              </w:rPr>
+            </w:pPr>
+            <w:r>
+              <w:rPr>
+                <w:rFonts w:eastAsiaTheme="majorEastAsia"/>
+                <w:sz w:val="24"/>
+                <w:szCs w:val="24"/>
+              </w:rPr>
+              <w:t>Considero que por el momento no es necesario redistribuir las actividades, ya que como equipo hemos mantenido un buen ritmo de trabajo y una distribución adecuada de las responsabilidades.</w:t>
+            </w:r>
+          </w:p>
+          <w:p>
+            <w:pPr>
+              <w:jc w:val="both"/>
+              <w:rPr>
+                <w:rFonts w:eastAsiaTheme="majorEastAsia"/>
                 <w:sz w:val="24"/>
                 <w:szCs w:val="24"/>
               </w:rPr>
@@ -1044,11 +1247,18 @@
               <w:jc w:val="both"/>
               <w:rPr>
                 <w:rFonts w:eastAsiaTheme="majorEastAsia"/>
-                <w:color w:val="767171" w:themeColor="background2" w:themeShade="80"/>
                 <w:sz w:val="24"/>
                 <w:szCs w:val="24"/>
               </w:rPr>
             </w:pPr>
+            <w:r>
+              <w:rPr>
+                <w:rFonts w:eastAsiaTheme="majorEastAsia"/>
+                <w:sz w:val="24"/>
+                <w:szCs w:val="24"/>
+              </w:rPr>
+              <w:t>Además, algunas tareas las hemos desarrollado en conjunto, lo que nos ha permitido apoyarnos mutuamente y resolver dudas. Por ahora, creo que vamos bien y que lo importante es mantener esta organización, revisando los avances para realizar ajustes si es necesario.</w:t>
+            </w:r>
           </w:p>
           <w:p>
             <w:pPr>
@@ -1139,10 +1349,18 @@
                 <w:sz w:val="24"/>
                 <w:szCs w:val="24"/>
               </w:rPr>
-              <w:t>. APT  grupal</w:t>
+              <w:t xml:space="preserve">. </w:t>
             </w:r>
-            <w:bookmarkStart w:id="0" w:name="_GoBack"/>
-            <w:bookmarkEnd w:id="0"/>
+            <w:proofErr w:type="gramStart"/>
+            <w:r>
+              <w:rPr>
+                <w:rFonts w:eastAsiaTheme="majorEastAsia"/>
+                <w:sz w:val="24"/>
+                <w:szCs w:val="24"/>
+              </w:rPr>
+              <w:t>APT  grupal</w:t>
+            </w:r>
+            <w:proofErr w:type="gramEnd"/>
           </w:p>
         </w:tc>
       </w:tr>
@@ -1180,7 +1398,6 @@
               <w:jc w:val="both"/>
               <w:rPr>
                 <w:rFonts w:eastAsiaTheme="majorEastAsia"/>
-                <w:color w:val="767171" w:themeColor="background2" w:themeShade="80"/>
                 <w:sz w:val="24"/>
                 <w:szCs w:val="24"/>
               </w:rPr>
@@ -1191,7 +1408,24 @@
               <w:jc w:val="both"/>
               <w:rPr>
                 <w:rFonts w:eastAsiaTheme="majorEastAsia"/>
-                <w:color w:val="767171" w:themeColor="background2" w:themeShade="80"/>
+                <w:sz w:val="24"/>
+                <w:szCs w:val="24"/>
+              </w:rPr>
+            </w:pPr>
+            <w:r>
+              <w:rPr>
+                <w:rFonts w:eastAsiaTheme="majorEastAsia"/>
+                <w:sz w:val="24"/>
+                <w:szCs w:val="24"/>
+              </w:rPr>
+              <w:t>Evalúo muy positivamente el trabajo en grupo, ya que considero que hemos formado un equipo muy unido, con una buena convivencia y una dinámica de trabajo entretenida. Nos llevamos bien, compartimos ideas similares y tenemos un objetivo en común: desarrollar el proyecto de la mejor manera posible, con compromiso y dedicación. Esto hace que trabajar juntos sea más fácil y que exista una buena disposición para colaborar y apoyarnos mutuamente.</w:t>
+            </w:r>
+          </w:p>
+          <w:p>
+            <w:pPr>
+              <w:jc w:val="both"/>
+              <w:rPr>
+                <w:rFonts w:eastAsiaTheme="majorEastAsia"/>
                 <w:sz w:val="24"/>
                 <w:szCs w:val="24"/>
               </w:rPr>
@@ -1202,11 +1436,18 @@
               <w:jc w:val="both"/>
               <w:rPr>
                 <w:rFonts w:eastAsiaTheme="majorEastAsia"/>
-                <w:color w:val="767171" w:themeColor="background2" w:themeShade="80"/>
                 <w:sz w:val="24"/>
                 <w:szCs w:val="24"/>
               </w:rPr>
             </w:pPr>
+            <w:r>
+              <w:rPr>
+                <w:rFonts w:eastAsiaTheme="majorEastAsia"/>
+                <w:sz w:val="24"/>
+                <w:szCs w:val="24"/>
+              </w:rPr>
+              <w:t>Como aspecto positivo, destaco la comunicación, la confianza y las ganas que tenemos de hacer un buen trabajo. Como oportunidad de mejora, creo que podemos seguir fortaleciendo nuestra organización y mantener una comunicación constante para anticiparnos a posibles dificultades, especialmente cuando aumente la carga de trabajo.</w:t>
+            </w:r>
           </w:p>
           <w:p>
             <w:pPr>
@@ -1272,7 +1513,7 @@
 </file>
 
 <file path=word/endnotes.xml><?xml version="1.0" encoding="utf-8"?>
-<w:endnotes xmlns:wpc="http://schemas.microsoft.com/office/word/2010/wordprocessingCanvas" xmlns:cx="http://schemas.microsoft.com/office/drawing/2014/chartex" xmlns:mc="http://schemas.openxmlformats.org/markup-compatibility/2006" xmlns:o="urn:schemas-microsoft-com:office:office" xmlns:r="http://schemas.openxmlformats.org/officeDocument/2006/relationships" xmlns:m="http://schemas.openxmlformats.org/officeDocument/2006/math" xmlns:v="urn:schemas-microsoft-com:vml" xmlns:wp14="http://schemas.microsoft.com/office/word/2010/wordprocessingDrawing" xmlns:wp="http://schemas.openxmlformats.org/drawingml/2006/wordprocessingDrawing" xmlns:w10="urn:schemas-microsoft-com:office:word" xmlns:w="http://schemas.openxmlformats.org/wordprocessingml/2006/main" xmlns:w14="http://schemas.microsoft.com/office/word/2010/wordml" xmlns:w15="http://schemas.microsoft.com/office/word/2012/wordml" xmlns:w16se="http://schemas.microsoft.com/office/word/2015/wordml/symex" xmlns:wpg="http://schemas.microsoft.com/office/word/2010/wordprocessingGroup" xmlns:wpi="http://schemas.microsoft.com/office/word/2010/wordprocessingInk" xmlns:wne="http://schemas.microsoft.com/office/word/2006/wordml" xmlns:wps="http://schemas.microsoft.com/office/word/2010/wordprocessingShape" mc:Ignorable="w14 w15 w16se wp14">
+<w:endnotes xmlns:wpc="http://schemas.microsoft.com/office/word/2010/wordprocessingCanvas" xmlns:cx="http://schemas.microsoft.com/office/drawing/2014/chartex" xmlns:cx1="http://schemas.microsoft.com/office/drawing/2015/9/8/chartex" xmlns:cx2="http://schemas.microsoft.com/office/drawing/2015/10/21/chartex" xmlns:cx3="http://schemas.microsoft.com/office/drawing/2016/5/9/chartex" xmlns:cx4="http://schemas.microsoft.com/office/drawing/2016/5/10/chartex" xmlns:cx5="http://schemas.microsoft.com/office/drawing/2016/5/11/chartex" xmlns:cx6="http://schemas.microsoft.com/office/drawing/2016/5/12/chartex" xmlns:cx7="http://schemas.microsoft.com/office/drawing/2016/5/13/chartex" xmlns:cx8="http://schemas.microsoft.com/office/drawing/2016/5/14/chartex" xmlns:mc="http://schemas.openxmlformats.org/markup-compatibility/2006" xmlns:aink="http://schemas.microsoft.com/office/drawing/2016/ink" xmlns:am3d="http://schemas.microsoft.com/office/drawing/2017/model3d" xmlns:o="urn:schemas-microsoft-com:office:office" xmlns:oel="http://schemas.microsoft.com/office/2019/extlst" xmlns:r="http://schemas.openxmlformats.org/officeDocument/2006/relationships" xmlns:m="http://schemas.openxmlformats.org/officeDocument/2006/math" xmlns:v="urn:schemas-microsoft-com:vml" xmlns:wp14="http://schemas.microsoft.com/office/word/2010/wordprocessingDrawing" xmlns:wp="http://schemas.openxmlformats.org/drawingml/2006/wordprocessingDrawing" xmlns:w10="urn:schemas-microsoft-com:office:word" xmlns:w="http://schemas.openxmlformats.org/wordprocessingml/2006/main" xmlns:w14="http://schemas.microsoft.com/office/word/2010/wordml" xmlns:w15="http://schemas.microsoft.com/office/word/2012/wordml" xmlns:w16cex="http://schemas.microsoft.com/office/word/2018/wordml/cex" xmlns:w16cid="http://schemas.microsoft.com/office/word/2016/wordml/cid" xmlns:w16="http://schemas.microsoft.com/office/word/2018/wordml" xmlns:w16du="http://schemas.microsoft.com/office/word/2023/wordml/word16du" xmlns:w16sdtdh="http://schemas.microsoft.com/office/word/2020/wordml/sdtdatahash" xmlns:w16sdtfl="http://schemas.microsoft.com/office/word/2024/wordml/sdtformatlock" xmlns:w16se="http://schemas.microsoft.com/office/word/2015/wordml/symex" xmlns:wpg="http://schemas.microsoft.com/office/word/2010/wordprocessingGroup" xmlns:wpi="http://schemas.microsoft.com/office/word/2010/wordprocessingInk" xmlns:wne="http://schemas.microsoft.com/office/word/2006/wordml" xmlns:wps="http://schemas.microsoft.com/office/word/2010/wordprocessingShape" mc:Ignorable="w14 w15 w16se w16cid w16 w16cex w16sdtdh w16sdtfl w16du wp14">
   <w:endnote w:type="separator" w:id="-1">
     <w:p>
       <w:pPr>
@@ -1297,7 +1538,7 @@
 </file>
 
 <file path=word/footer1.xml><?xml version="1.0" encoding="utf-8"?>
-<w:ftr xmlns:wpc="http://schemas.microsoft.com/office/word/2010/wordprocessingCanvas" xmlns:cx="http://schemas.microsoft.com/office/drawing/2014/chartex" xmlns:mc="http://schemas.openxmlformats.org/markup-compatibility/2006" xmlns:o="urn:schemas-microsoft-com:office:office" xmlns:r="http://schemas.openxmlformats.org/officeDocument/2006/relationships" xmlns:m="http://schemas.openxmlformats.org/officeDocument/2006/math" xmlns:v="urn:schemas-microsoft-com:vml" xmlns:wp14="http://schemas.microsoft.com/office/word/2010/wordprocessingDrawing" xmlns:wp="http://schemas.openxmlformats.org/drawingml/2006/wordprocessingDrawing" xmlns:w10="urn:schemas-microsoft-com:office:word" xmlns:w="http://schemas.openxmlformats.org/wordprocessingml/2006/main" xmlns:w14="http://schemas.microsoft.com/office/word/2010/wordml" xmlns:w15="http://schemas.microsoft.com/office/word/2012/wordml" xmlns:w16se="http://schemas.microsoft.com/office/word/2015/wordml/symex" xmlns:wpg="http://schemas.microsoft.com/office/word/2010/wordprocessingGroup" xmlns:wpi="http://schemas.microsoft.com/office/word/2010/wordprocessingInk" xmlns:wne="http://schemas.microsoft.com/office/word/2006/wordml" xmlns:wps="http://schemas.microsoft.com/office/word/2010/wordprocessingShape" mc:Ignorable="w14 w15 w16se wp14">
+<w:ftr xmlns:wpc="http://schemas.microsoft.com/office/word/2010/wordprocessingCanvas" xmlns:cx="http://schemas.microsoft.com/office/drawing/2014/chartex" xmlns:cx1="http://schemas.microsoft.com/office/drawing/2015/9/8/chartex" xmlns:cx2="http://schemas.microsoft.com/office/drawing/2015/10/21/chartex" xmlns:cx3="http://schemas.microsoft.com/office/drawing/2016/5/9/chartex" xmlns:cx4="http://schemas.microsoft.com/office/drawing/2016/5/10/chartex" xmlns:cx5="http://schemas.microsoft.com/office/drawing/2016/5/11/chartex" xmlns:cx6="http://schemas.microsoft.com/office/drawing/2016/5/12/chartex" xmlns:cx7="http://schemas.microsoft.com/office/drawing/2016/5/13/chartex" xmlns:cx8="http://schemas.microsoft.com/office/drawing/2016/5/14/chartex" xmlns:mc="http://schemas.openxmlformats.org/markup-compatibility/2006" xmlns:aink="http://schemas.microsoft.com/office/drawing/2016/ink" xmlns:am3d="http://schemas.microsoft.com/office/drawing/2017/model3d" xmlns:o="urn:schemas-microsoft-com:office:office" xmlns:oel="http://schemas.microsoft.com/office/2019/extlst" xmlns:r="http://schemas.openxmlformats.org/officeDocument/2006/relationships" xmlns:m="http://schemas.openxmlformats.org/officeDocument/2006/math" xmlns:v="urn:schemas-microsoft-com:vml" xmlns:wp14="http://schemas.microsoft.com/office/word/2010/wordprocessingDrawing" xmlns:wp="http://schemas.openxmlformats.org/drawingml/2006/wordprocessingDrawing" xmlns:w10="urn:schemas-microsoft-com:office:word" xmlns:w="http://schemas.openxmlformats.org/wordprocessingml/2006/main" xmlns:w14="http://schemas.microsoft.com/office/word/2010/wordml" xmlns:w15="http://schemas.microsoft.com/office/word/2012/wordml" xmlns:w16cex="http://schemas.microsoft.com/office/word/2018/wordml/cex" xmlns:w16cid="http://schemas.microsoft.com/office/word/2016/wordml/cid" xmlns:w16="http://schemas.microsoft.com/office/word/2018/wordml" xmlns:w16du="http://schemas.microsoft.com/office/word/2023/wordml/word16du" xmlns:w16sdtdh="http://schemas.microsoft.com/office/word/2020/wordml/sdtdatahash" xmlns:w16sdtfl="http://schemas.microsoft.com/office/word/2024/wordml/sdtformatlock" xmlns:w16se="http://schemas.microsoft.com/office/word/2015/wordml/symex" xmlns:wpg="http://schemas.microsoft.com/office/word/2010/wordprocessingGroup" xmlns:wpi="http://schemas.microsoft.com/office/word/2010/wordprocessingInk" xmlns:wne="http://schemas.microsoft.com/office/word/2006/wordml" xmlns:wps="http://schemas.microsoft.com/office/word/2010/wordprocessingShape" mc:Ignorable="w14 w15 w16se w16cid w16 w16cex w16sdtdh w16sdtfl w16du wp14">
   <w:sdt>
     <w:sdtPr>
       <w:id w:val="-937982979"/>
@@ -1306,7 +1547,6 @@
         <w:docPartUnique/>
       </w:docPartObj>
     </w:sdtPr>
-    <w:sdtEndPr/>
     <w:sdtContent>
       <w:p>
         <w:pPr>
@@ -1518,7 +1758,7 @@
             </mc:Choice>
             <mc:Fallback>
               <w:pict>
-                <v:group w14:anchorId="51D00065" id="Grupo 32" o:spid="_x0000_s1026" style="position:absolute;margin-left:0;margin-top:0;width:610.5pt;height:15pt;z-index:251659264;mso-width-percent:1000;mso-position-horizontal:center;mso-position-horizontal-relative:page;mso-position-vertical:center;mso-position-vertical-relative:bottom-margin-area;mso-width-percent:1000" coordorigin=",14970" coordsize="12255,300" o:gfxdata="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">
+                <v:group w14:anchorId="51D00065" id="Grupo 32" o:spid="_x0000_s1026" style="position:absolute;margin-left:0;margin-top:0;width:610.5pt;height:15pt;z-index:251659264;mso-width-percent:1000;mso-position-horizontal:center;mso-position-horizontal-relative:page;mso-position-vertical:center;mso-position-vertical-relative:bottom-margin-area;mso-width-percent:1000" coordorigin=",14970" coordsize="12255,300" o:gfxdata="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">
                   <v:shapetype id="_x0000_t202" coordsize="21600,21600" o:spt="202" path="m,l,21600r21600,l21600,xe">
                     <v:stroke joinstyle="miter"/>
                     <v:path gradientshapeok="t" o:connecttype="rect"/>
@@ -1585,7 +1825,7 @@
 </file>
 
 <file path=word/footnotes.xml><?xml version="1.0" encoding="utf-8"?>
-<w:footnotes xmlns:wpc="http://schemas.microsoft.com/office/word/2010/wordprocessingCanvas" xmlns:cx="http://schemas.microsoft.com/office/drawing/2014/chartex" xmlns:mc="http://schemas.openxmlformats.org/markup-compatibility/2006" xmlns:o="urn:schemas-microsoft-com:office:office" xmlns:r="http://schemas.openxmlformats.org/officeDocument/2006/relationships" xmlns:m="http://schemas.openxmlformats.org/officeDocument/2006/math" xmlns:v="urn:schemas-microsoft-com:vml" xmlns:wp14="http://schemas.microsoft.com/office/word/2010/wordprocessingDrawing" xmlns:wp="http://schemas.openxmlformats.org/drawingml/2006/wordprocessingDrawing" xmlns:w10="urn:schemas-microsoft-com:office:word" xmlns:w="http://schemas.openxmlformats.org/wordprocessingml/2006/main" xmlns:w14="http://schemas.microsoft.com/office/word/2010/wordml" xmlns:w15="http://schemas.microsoft.com/office/word/2012/wordml" xmlns:w16se="http://schemas.microsoft.com/office/word/2015/wordml/symex" xmlns:wpg="http://schemas.microsoft.com/office/word/2010/wordprocessingGroup" xmlns:wpi="http://schemas.microsoft.com/office/word/2010/wordprocessingInk" xmlns:wne="http://schemas.microsoft.com/office/word/2006/wordml" xmlns:wps="http://schemas.microsoft.com/office/word/2010/wordprocessingShape" mc:Ignorable="w14 w15 w16se wp14">
+<w:footnotes xmlns:wpc="http://schemas.microsoft.com/office/word/2010/wordprocessingCanvas" xmlns:cx="http://schemas.microsoft.com/office/drawing/2014/chartex" xmlns:cx1="http://schemas.microsoft.com/office/drawing/2015/9/8/chartex" xmlns:cx2="http://schemas.microsoft.com/office/drawing/2015/10/21/chartex" xmlns:cx3="http://schemas.microsoft.com/office/drawing/2016/5/9/chartex" xmlns:cx4="http://schemas.microsoft.com/office/drawing/2016/5/10/chartex" xmlns:cx5="http://schemas.microsoft.com/office/drawing/2016/5/11/chartex" xmlns:cx6="http://schemas.microsoft.com/office/drawing/2016/5/12/chartex" xmlns:cx7="http://schemas.microsoft.com/office/drawing/2016/5/13/chartex" xmlns:cx8="http://schemas.microsoft.com/office/drawing/2016/5/14/chartex" xmlns:mc="http://schemas.openxmlformats.org/markup-compatibility/2006" xmlns:aink="http://schemas.microsoft.com/office/drawing/2016/ink" xmlns:am3d="http://schemas.microsoft.com/office/drawing/2017/model3d" xmlns:o="urn:schemas-microsoft-com:office:office" xmlns:oel="http://schemas.microsoft.com/office/2019/extlst" xmlns:r="http://schemas.openxmlformats.org/officeDocument/2006/relationships" xmlns:m="http://schemas.openxmlformats.org/officeDocument/2006/math" xmlns:v="urn:schemas-microsoft-com:vml" xmlns:wp14="http://schemas.microsoft.com/office/word/2010/wordprocessingDrawing" xmlns:wp="http://schemas.openxmlformats.org/drawingml/2006/wordprocessingDrawing" xmlns:w10="urn:schemas-microsoft-com:office:word" xmlns:w="http://schemas.openxmlformats.org/wordprocessingml/2006/main" xmlns:w14="http://schemas.microsoft.com/office/word/2010/wordml" xmlns:w15="http://schemas.microsoft.com/office/word/2012/wordml" xmlns:w16cex="http://schemas.microsoft.com/office/word/2018/wordml/cex" xmlns:w16cid="http://schemas.microsoft.com/office/word/2016/wordml/cid" xmlns:w16="http://schemas.microsoft.com/office/word/2018/wordml" xmlns:w16du="http://schemas.microsoft.com/office/word/2023/wordml/word16du" xmlns:w16sdtdh="http://schemas.microsoft.com/office/word/2020/wordml/sdtdatahash" xmlns:w16sdtfl="http://schemas.microsoft.com/office/word/2024/wordml/sdtformatlock" xmlns:w16se="http://schemas.microsoft.com/office/word/2015/wordml/symex" xmlns:wpg="http://schemas.microsoft.com/office/word/2010/wordprocessingGroup" xmlns:wpi="http://schemas.microsoft.com/office/word/2010/wordprocessingInk" xmlns:wne="http://schemas.microsoft.com/office/word/2006/wordml" xmlns:wps="http://schemas.microsoft.com/office/word/2010/wordprocessingShape" mc:Ignorable="w14 w15 w16se w16cid w16 w16cex w16sdtdh w16sdtfl w16du wp14">
   <w:footnote w:type="separator" w:id="-1">
     <w:p>
       <w:pPr>
@@ -1610,7 +1850,7 @@
 </file>
 
 <file path=word/header1.xml><?xml version="1.0" encoding="utf-8"?>
-<w:hdr xmlns:wpc="http://schemas.microsoft.com/office/word/2010/wordprocessingCanvas" xmlns:cx="http://schemas.microsoft.com/office/drawing/2014/chartex" xmlns:mc="http://schemas.openxmlformats.org/markup-compatibility/2006" xmlns:o="urn:schemas-microsoft-com:office:office" xmlns:r="http://schemas.openxmlformats.org/officeDocument/2006/relationships" xmlns:m="http://schemas.openxmlformats.org/officeDocument/2006/math" xmlns:v="urn:schemas-microsoft-com:vml" xmlns:wp14="http://schemas.microsoft.com/office/word/2010/wordprocessingDrawing" xmlns:wp="http://schemas.openxmlformats.org/drawingml/2006/wordprocessingDrawing" xmlns:w10="urn:schemas-microsoft-com:office:word" xmlns:w="http://schemas.openxmlformats.org/wordprocessingml/2006/main" xmlns:w14="http://schemas.microsoft.com/office/word/2010/wordml" xmlns:w15="http://schemas.microsoft.com/office/word/2012/wordml" xmlns:w16se="http://schemas.microsoft.com/office/word/2015/wordml/symex" xmlns:wpg="http://schemas.microsoft.com/office/word/2010/wordprocessingGroup" xmlns:wpi="http://schemas.microsoft.com/office/word/2010/wordprocessingInk" xmlns:wne="http://schemas.microsoft.com/office/word/2006/wordml" xmlns:wps="http://schemas.microsoft.com/office/word/2010/wordprocessingShape" mc:Ignorable="w14 w15 w16se wp14">
+<w:hdr xmlns:wpc="http://schemas.microsoft.com/office/word/2010/wordprocessingCanvas" xmlns:cx="http://schemas.microsoft.com/office/drawing/2014/chartex" xmlns:cx1="http://schemas.microsoft.com/office/drawing/2015/9/8/chartex" xmlns:cx2="http://schemas.microsoft.com/office/drawing/2015/10/21/chartex" xmlns:cx3="http://schemas.microsoft.com/office/drawing/2016/5/9/chartex" xmlns:cx4="http://schemas.microsoft.com/office/drawing/2016/5/10/chartex" xmlns:cx5="http://schemas.microsoft.com/office/drawing/2016/5/11/chartex" xmlns:cx6="http://schemas.microsoft.com/office/drawing/2016/5/12/chartex" xmlns:cx7="http://schemas.microsoft.com/office/drawing/2016/5/13/chartex" xmlns:cx8="http://schemas.microsoft.com/office/drawing/2016/5/14/chartex" xmlns:mc="http://schemas.openxmlformats.org/markup-compatibility/2006" xmlns:aink="http://schemas.microsoft.com/office/drawing/2016/ink" xmlns:am3d="http://schemas.microsoft.com/office/drawing/2017/model3d" xmlns:o="urn:schemas-microsoft-com:office:office" xmlns:oel="http://schemas.microsoft.com/office/2019/extlst" xmlns:r="http://schemas.openxmlformats.org/officeDocument/2006/relationships" xmlns:m="http://schemas.openxmlformats.org/officeDocument/2006/math" xmlns:v="urn:schemas-microsoft-com:vml" xmlns:wp14="http://schemas.microsoft.com/office/word/2010/wordprocessingDrawing" xmlns:wp="http://schemas.openxmlformats.org/drawingml/2006/wordprocessingDrawing" xmlns:w10="urn:schemas-microsoft-com:office:word" xmlns:w="http://schemas.openxmlformats.org/wordprocessingml/2006/main" xmlns:w14="http://schemas.microsoft.com/office/word/2010/wordml" xmlns:w15="http://schemas.microsoft.com/office/word/2012/wordml" xmlns:w16cex="http://schemas.microsoft.com/office/word/2018/wordml/cex" xmlns:w16cid="http://schemas.microsoft.com/office/word/2016/wordml/cid" xmlns:w16="http://schemas.microsoft.com/office/word/2018/wordml" xmlns:w16du="http://schemas.microsoft.com/office/word/2023/wordml/word16du" xmlns:w16sdtdh="http://schemas.microsoft.com/office/word/2020/wordml/sdtdatahash" xmlns:w16sdtfl="http://schemas.microsoft.com/office/word/2024/wordml/sdtformatlock" xmlns:w16se="http://schemas.microsoft.com/office/word/2015/wordml/symex" xmlns:wpg="http://schemas.microsoft.com/office/word/2010/wordprocessingGroup" xmlns:wpi="http://schemas.microsoft.com/office/word/2010/wordprocessingInk" xmlns:wne="http://schemas.microsoft.com/office/word/2006/wordml" xmlns:wps="http://schemas.microsoft.com/office/word/2010/wordprocessingShape" mc:Ignorable="w14 w15 w16se w16cid w16 w16cex w16sdtdh w16sdtfl w16du wp14">
   <w:tbl>
     <w:tblPr>
       <w:tblStyle w:val="Tablaconcuadrcula"/>
@@ -1790,7 +2030,7 @@
 </file>
 
 <file path=word/header2.xml><?xml version="1.0" encoding="utf-8"?>
-<w:hdr xmlns:wpc="http://schemas.microsoft.com/office/word/2010/wordprocessingCanvas" xmlns:cx="http://schemas.microsoft.com/office/drawing/2014/chartex" xmlns:mc="http://schemas.openxmlformats.org/markup-compatibility/2006" xmlns:o="urn:schemas-microsoft-com:office:office" xmlns:r="http://schemas.openxmlformats.org/officeDocument/2006/relationships" xmlns:m="http://schemas.openxmlformats.org/officeDocument/2006/math" xmlns:v="urn:schemas-microsoft-com:vml" xmlns:wp14="http://schemas.microsoft.com/office/word/2010/wordprocessingDrawing" xmlns:wp="http://schemas.openxmlformats.org/drawingml/2006/wordprocessingDrawing" xmlns:w10="urn:schemas-microsoft-com:office:word" xmlns:w="http://schemas.openxmlformats.org/wordprocessingml/2006/main" xmlns:w14="http://schemas.microsoft.com/office/word/2010/wordml" xmlns:w15="http://schemas.microsoft.com/office/word/2012/wordml" xmlns:w16se="http://schemas.microsoft.com/office/word/2015/wordml/symex" xmlns:wpg="http://schemas.microsoft.com/office/word/2010/wordprocessingGroup" xmlns:wpi="http://schemas.microsoft.com/office/word/2010/wordprocessingInk" xmlns:wne="http://schemas.microsoft.com/office/word/2006/wordml" xmlns:wps="http://schemas.microsoft.com/office/word/2010/wordprocessingShape" mc:Ignorable="w14 w15 w16se wp14">
+<w:hdr xmlns:wpc="http://schemas.microsoft.com/office/word/2010/wordprocessingCanvas" xmlns:cx="http://schemas.microsoft.com/office/drawing/2014/chartex" xmlns:cx1="http://schemas.microsoft.com/office/drawing/2015/9/8/chartex" xmlns:cx2="http://schemas.microsoft.com/office/drawing/2015/10/21/chartex" xmlns:cx3="http://schemas.microsoft.com/office/drawing/2016/5/9/chartex" xmlns:cx4="http://schemas.microsoft.com/office/drawing/2016/5/10/chartex" xmlns:cx5="http://schemas.microsoft.com/office/drawing/2016/5/11/chartex" xmlns:cx6="http://schemas.microsoft.com/office/drawing/2016/5/12/chartex" xmlns:cx7="http://schemas.microsoft.com/office/drawing/2016/5/13/chartex" xmlns:cx8="http://schemas.microsoft.com/office/drawing/2016/5/14/chartex" xmlns:mc="http://schemas.openxmlformats.org/markup-compatibility/2006" xmlns:aink="http://schemas.microsoft.com/office/drawing/2016/ink" xmlns:am3d="http://schemas.microsoft.com/office/drawing/2017/model3d" xmlns:o="urn:schemas-microsoft-com:office:office" xmlns:oel="http://schemas.microsoft.com/office/2019/extlst" xmlns:r="http://schemas.openxmlformats.org/officeDocument/2006/relationships" xmlns:m="http://schemas.openxmlformats.org/officeDocument/2006/math" xmlns:v="urn:schemas-microsoft-com:vml" xmlns:wp14="http://schemas.microsoft.com/office/word/2010/wordprocessingDrawing" xmlns:wp="http://schemas.openxmlformats.org/drawingml/2006/wordprocessingDrawing" xmlns:w10="urn:schemas-microsoft-com:office:word" xmlns:w="http://schemas.openxmlformats.org/wordprocessingml/2006/main" xmlns:w14="http://schemas.microsoft.com/office/word/2010/wordml" xmlns:w15="http://schemas.microsoft.com/office/word/2012/wordml" xmlns:w16cex="http://schemas.microsoft.com/office/word/2018/wordml/cex" xmlns:w16cid="http://schemas.microsoft.com/office/word/2016/wordml/cid" xmlns:w16="http://schemas.microsoft.com/office/word/2018/wordml" xmlns:w16du="http://schemas.microsoft.com/office/word/2023/wordml/word16du" xmlns:w16sdtdh="http://schemas.microsoft.com/office/word/2020/wordml/sdtdatahash" xmlns:w16sdtfl="http://schemas.microsoft.com/office/word/2024/wordml/sdtformatlock" xmlns:w16se="http://schemas.microsoft.com/office/word/2015/wordml/symex" xmlns:wpg="http://schemas.microsoft.com/office/word/2010/wordprocessingGroup" xmlns:wpi="http://schemas.microsoft.com/office/word/2010/wordprocessingInk" xmlns:wne="http://schemas.microsoft.com/office/word/2006/wordml" xmlns:wps="http://schemas.microsoft.com/office/word/2010/wordprocessingShape" mc:Ignorable="w14 w15 w16se w16cid w16 w16cex w16sdtdh w16sdtfl w16du wp14">
   <w:tbl>
     <w:tblPr>
       <w:tblStyle w:val="Tablaconcuadrcula"/>
@@ -2065,7 +2305,7 @@
 </file>
 
 <file path=word/numbering.xml><?xml version="1.0" encoding="utf-8"?>
-<w:numbering xmlns:wpc="http://schemas.microsoft.com/office/word/2010/wordprocessingCanvas" xmlns:cx="http://schemas.microsoft.com/office/drawing/2014/chartex" xmlns:mc="http://schemas.openxmlformats.org/markup-compatibility/2006" xmlns:o="urn:schemas-microsoft-com:office:office" xmlns:r="http://schemas.openxmlformats.org/officeDocument/2006/relationships" xmlns:m="http://schemas.openxmlformats.org/officeDocument/2006/math" xmlns:v="urn:schemas-microsoft-com:vml" xmlns:wp14="http://schemas.microsoft.com/office/word/2010/wordprocessingDrawing" xmlns:wp="http://schemas.openxmlformats.org/drawingml/2006/wordprocessingDrawing" xmlns:w10="urn:schemas-microsoft-com:office:word" xmlns:w="http://schemas.openxmlformats.org/wordprocessingml/2006/main" xmlns:w14="http://schemas.microsoft.com/office/word/2010/wordml" xmlns:w15="http://schemas.microsoft.com/office/word/2012/wordml" xmlns:w16se="http://schemas.microsoft.com/office/word/2015/wordml/symex" xmlns:wpg="http://schemas.microsoft.com/office/word/2010/wordprocessingGroup" xmlns:wpi="http://schemas.microsoft.com/office/word/2010/wordprocessingInk" xmlns:wne="http://schemas.microsoft.com/office/word/2006/wordml" xmlns:wps="http://schemas.microsoft.com/office/word/2010/wordprocessingShape" mc:Ignorable="w14 w15 w16se wp14">
+<w:numbering xmlns:wpc="http://schemas.microsoft.com/office/word/2010/wordprocessingCanvas" xmlns:cx="http://schemas.microsoft.com/office/drawing/2014/chartex" xmlns:cx1="http://schemas.microsoft.com/office/drawing/2015/9/8/chartex" xmlns:cx2="http://schemas.microsoft.com/office/drawing/2015/10/21/chartex" xmlns:cx3="http://schemas.microsoft.com/office/drawing/2016/5/9/chartex" xmlns:cx4="http://schemas.microsoft.com/office/drawing/2016/5/10/chartex" xmlns:cx5="http://schemas.microsoft.com/office/drawing/2016/5/11/chartex" xmlns:cx6="http://schemas.microsoft.com/office/drawing/2016/5/12/chartex" xmlns:cx7="http://schemas.microsoft.com/office/drawing/2016/5/13/chartex" xmlns:cx8="http://schemas.microsoft.com/office/drawing/2016/5/14/chartex" xmlns:mc="http://schemas.openxmlformats.org/markup-compatibility/2006" xmlns:aink="http://schemas.microsoft.com/office/drawing/2016/ink" xmlns:am3d="http://schemas.microsoft.com/office/drawing/2017/model3d" xmlns:o="urn:schemas-microsoft-com:office:office" xmlns:oel="http://schemas.microsoft.com/office/2019/extlst" xmlns:r="http://schemas.openxmlformats.org/officeDocument/2006/relationships" xmlns:m="http://schemas.openxmlformats.org/officeDocument/2006/math" xmlns:v="urn:schemas-microsoft-com:vml" xmlns:wp14="http://schemas.microsoft.com/office/word/2010/wordprocessingDrawing" xmlns:wp="http://schemas.openxmlformats.org/drawingml/2006/wordprocessingDrawing" xmlns:w10="urn:schemas-microsoft-com:office:word" xmlns:w="http://schemas.openxmlformats.org/wordprocessingml/2006/main" xmlns:w14="http://schemas.microsoft.com/office/word/2010/wordml" xmlns:w15="http://schemas.microsoft.com/office/word/2012/wordml" xmlns:w16cex="http://schemas.microsoft.com/office/word/2018/wordml/cex" xmlns:w16cid="http://schemas.microsoft.com/office/word/2016/wordml/cid" xmlns:w16="http://schemas.microsoft.com/office/word/2018/wordml" xmlns:w16du="http://schemas.microsoft.com/office/word/2023/wordml/word16du" xmlns:w16sdtdh="http://schemas.microsoft.com/office/word/2020/wordml/sdtdatahash" xmlns:w16sdtfl="http://schemas.microsoft.com/office/word/2024/wordml/sdtformatlock" xmlns:w16se="http://schemas.microsoft.com/office/word/2015/wordml/symex" xmlns:wpg="http://schemas.microsoft.com/office/word/2010/wordprocessingGroup" xmlns:wpi="http://schemas.microsoft.com/office/word/2010/wordprocessingInk" xmlns:wne="http://schemas.microsoft.com/office/word/2006/wordml" xmlns:wps="http://schemas.microsoft.com/office/word/2010/wordprocessingShape" mc:Ignorable="w14 w15 w16se w16cid w16 w16cex w16sdtdh w16sdtfl w16du wp14">
   <w:abstractNum w:abstractNumId="0" w15:restartNumberingAfterBreak="0">
     <w:nsid w:val="049156A1"/>
     <w:multiLevelType w:val="hybridMultilevel"/>
@@ -6639,124 +6879,124 @@
       </w:rPr>
     </w:lvl>
   </w:abstractNum>
-  <w:num w:numId="1">
+  <w:num w:numId="1" w16cid:durableId="821198242">
     <w:abstractNumId w:val="3"/>
   </w:num>
-  <w:num w:numId="2">
+  <w:num w:numId="2" w16cid:durableId="746147859">
     <w:abstractNumId w:val="8"/>
   </w:num>
-  <w:num w:numId="3">
+  <w:num w:numId="3" w16cid:durableId="691347112">
     <w:abstractNumId w:val="12"/>
   </w:num>
-  <w:num w:numId="4">
+  <w:num w:numId="4" w16cid:durableId="1453984227">
     <w:abstractNumId w:val="28"/>
   </w:num>
-  <w:num w:numId="5">
+  <w:num w:numId="5" w16cid:durableId="568348940">
     <w:abstractNumId w:val="30"/>
   </w:num>
-  <w:num w:numId="6">
+  <w:num w:numId="6" w16cid:durableId="1920406451">
     <w:abstractNumId w:val="4"/>
   </w:num>
-  <w:num w:numId="7">
+  <w:num w:numId="7" w16cid:durableId="1946376631">
     <w:abstractNumId w:val="11"/>
   </w:num>
-  <w:num w:numId="8">
+  <w:num w:numId="8" w16cid:durableId="1537887234">
     <w:abstractNumId w:val="19"/>
   </w:num>
-  <w:num w:numId="9">
+  <w:num w:numId="9" w16cid:durableId="1163818204">
     <w:abstractNumId w:val="15"/>
   </w:num>
-  <w:num w:numId="10">
+  <w:num w:numId="10" w16cid:durableId="599997096">
     <w:abstractNumId w:val="9"/>
   </w:num>
-  <w:num w:numId="11">
+  <w:num w:numId="11" w16cid:durableId="1540239253">
     <w:abstractNumId w:val="24"/>
   </w:num>
-  <w:num w:numId="12">
+  <w:num w:numId="12" w16cid:durableId="1505510053">
     <w:abstractNumId w:val="35"/>
   </w:num>
-  <w:num w:numId="13">
+  <w:num w:numId="13" w16cid:durableId="1821926276">
     <w:abstractNumId w:val="29"/>
   </w:num>
-  <w:num w:numId="14">
+  <w:num w:numId="14" w16cid:durableId="1663312598">
     <w:abstractNumId w:val="1"/>
   </w:num>
-  <w:num w:numId="15">
+  <w:num w:numId="15" w16cid:durableId="876047213">
     <w:abstractNumId w:val="36"/>
   </w:num>
-  <w:num w:numId="16">
+  <w:num w:numId="16" w16cid:durableId="1390105671">
     <w:abstractNumId w:val="21"/>
   </w:num>
-  <w:num w:numId="17">
+  <w:num w:numId="17" w16cid:durableId="1090737927">
     <w:abstractNumId w:val="17"/>
   </w:num>
-  <w:num w:numId="18">
+  <w:num w:numId="18" w16cid:durableId="2134977964">
     <w:abstractNumId w:val="31"/>
   </w:num>
-  <w:num w:numId="19">
+  <w:num w:numId="19" w16cid:durableId="1009525971">
     <w:abstractNumId w:val="10"/>
   </w:num>
-  <w:num w:numId="20">
+  <w:num w:numId="20" w16cid:durableId="1638608582">
     <w:abstractNumId w:val="39"/>
   </w:num>
-  <w:num w:numId="21">
+  <w:num w:numId="21" w16cid:durableId="1527595120">
     <w:abstractNumId w:val="34"/>
   </w:num>
-  <w:num w:numId="22">
+  <w:num w:numId="22" w16cid:durableId="1427925800">
     <w:abstractNumId w:val="13"/>
   </w:num>
-  <w:num w:numId="23">
+  <w:num w:numId="23" w16cid:durableId="985822698">
     <w:abstractNumId w:val="14"/>
   </w:num>
-  <w:num w:numId="24">
+  <w:num w:numId="24" w16cid:durableId="964851190">
     <w:abstractNumId w:val="5"/>
   </w:num>
-  <w:num w:numId="25">
+  <w:num w:numId="25" w16cid:durableId="2116629122">
     <w:abstractNumId w:val="16"/>
   </w:num>
-  <w:num w:numId="26">
+  <w:num w:numId="26" w16cid:durableId="456336298">
     <w:abstractNumId w:val="20"/>
   </w:num>
-  <w:num w:numId="27">
+  <w:num w:numId="27" w16cid:durableId="1490245596">
     <w:abstractNumId w:val="23"/>
   </w:num>
-  <w:num w:numId="28">
+  <w:num w:numId="28" w16cid:durableId="1396930959">
     <w:abstractNumId w:val="0"/>
   </w:num>
-  <w:num w:numId="29">
+  <w:num w:numId="29" w16cid:durableId="1954939290">
     <w:abstractNumId w:val="18"/>
   </w:num>
-  <w:num w:numId="30">
+  <w:num w:numId="30" w16cid:durableId="168176951">
     <w:abstractNumId w:val="22"/>
   </w:num>
-  <w:num w:numId="31">
+  <w:num w:numId="31" w16cid:durableId="908150199">
     <w:abstractNumId w:val="2"/>
   </w:num>
-  <w:num w:numId="32">
+  <w:num w:numId="32" w16cid:durableId="1346790429">
     <w:abstractNumId w:val="7"/>
   </w:num>
-  <w:num w:numId="33">
+  <w:num w:numId="33" w16cid:durableId="130827108">
     <w:abstractNumId w:val="32"/>
   </w:num>
-  <w:num w:numId="34">
+  <w:num w:numId="34" w16cid:durableId="1488210931">
     <w:abstractNumId w:val="38"/>
   </w:num>
-  <w:num w:numId="35">
+  <w:num w:numId="35" w16cid:durableId="592054320">
     <w:abstractNumId w:val="6"/>
   </w:num>
-  <w:num w:numId="36">
+  <w:num w:numId="36" w16cid:durableId="2046903349">
     <w:abstractNumId w:val="25"/>
   </w:num>
-  <w:num w:numId="37">
+  <w:num w:numId="37" w16cid:durableId="1165899046">
     <w:abstractNumId w:val="37"/>
   </w:num>
-  <w:num w:numId="38">
+  <w:num w:numId="38" w16cid:durableId="601689202">
     <w:abstractNumId w:val="27"/>
   </w:num>
-  <w:num w:numId="39">
+  <w:num w:numId="39" w16cid:durableId="43608350">
     <w:abstractNumId w:val="26"/>
   </w:num>
-  <w:num w:numId="40">
+  <w:num w:numId="40" w16cid:durableId="1190608344">
     <w:abstractNumId w:val="33"/>
   </w:num>
   <w:numIdMacAtCleanup w:val="18"/>
@@ -6764,7 +7004,7 @@
 </file>
 
 <file path=word/styles.xml><?xml version="1.0" encoding="utf-8"?>
-<w:styles xmlns:mc="http://schemas.openxmlformats.org/markup-compatibility/2006" xmlns:r="http://schemas.openxmlformats.org/officeDocument/2006/relationships" xmlns:w="http://schemas.openxmlformats.org/wordprocessingml/2006/main" xmlns:w14="http://schemas.microsoft.com/office/word/2010/wordml" xmlns:w15="http://schemas.microsoft.com/office/word/2012/wordml" xmlns:w16se="http://schemas.microsoft.com/office/word/2015/wordml/symex" mc:Ignorable="w14 w15 w16se">
+<w:styles xmlns:mc="http://schemas.openxmlformats.org/markup-compatibility/2006" xmlns:r="http://schemas.openxmlformats.org/officeDocument/2006/relationships" xmlns:w="http://schemas.openxmlformats.org/wordprocessingml/2006/main" xmlns:w14="http://schemas.microsoft.com/office/word/2010/wordml" xmlns:w15="http://schemas.microsoft.com/office/word/2012/wordml" xmlns:w16cex="http://schemas.microsoft.com/office/word/2018/wordml/cex" xmlns:w16cid="http://schemas.microsoft.com/office/word/2016/wordml/cid" xmlns:w16="http://schemas.microsoft.com/office/word/2018/wordml" xmlns:w16du="http://schemas.microsoft.com/office/word/2023/wordml/word16du" xmlns:w16sdtdh="http://schemas.microsoft.com/office/word/2020/wordml/sdtdatahash" xmlns:w16sdtfl="http://schemas.microsoft.com/office/word/2024/wordml/sdtformatlock" xmlns:w16se="http://schemas.microsoft.com/office/word/2015/wordml/symex" mc:Ignorable="w14 w15 w16se w16cid w16 w16cex w16sdtdh w16sdtfl w16du">
   <w:docDefaults>
     <w:rPrDefault>
       <w:rPr>
@@ -6780,7 +7020,7 @@
       </w:pPr>
     </w:pPrDefault>
   </w:docDefaults>
-  <w:latentStyles w:defLockedState="0" w:defUIPriority="99" w:defSemiHidden="0" w:defUnhideWhenUsed="0" w:defQFormat="0" w:count="371">
+  <w:latentStyles w:defLockedState="0" w:defUIPriority="99" w:defSemiHidden="0" w:defUnhideWhenUsed="0" w:defQFormat="0" w:count="376">
     <w:lsdException w:name="Normal" w:uiPriority="0" w:qFormat="1"/>
     <w:lsdException w:name="heading 1" w:uiPriority="9" w:qFormat="1"/>
     <w:lsdException w:name="heading 2" w:semiHidden="1" w:uiPriority="9" w:unhideWhenUsed="1" w:qFormat="1"/>
@@ -7152,6 +7392,11 @@
     <w:lsdException w:name="List Table 5 Dark Accent 6" w:uiPriority="50"/>
     <w:lsdException w:name="List Table 6 Colorful Accent 6" w:uiPriority="51"/>
     <w:lsdException w:name="List Table 7 Colorful Accent 6" w:uiPriority="52"/>
+    <w:lsdException w:name="Mention" w:semiHidden="1" w:unhideWhenUsed="1"/>
+    <w:lsdException w:name="Smart Hyperlink" w:semiHidden="1" w:unhideWhenUsed="1"/>
+    <w:lsdException w:name="Hashtag" w:semiHidden="1" w:unhideWhenUsed="1"/>
+    <w:lsdException w:name="Unresolved Mention" w:semiHidden="1" w:unhideWhenUsed="1"/>
+    <w:lsdException w:name="Smart Link" w:semiHidden="1" w:unhideWhenUsed="1"/>
   </w:latentStyles>
   <w:style w:type="paragraph" w:default="1" w:styleId="Normal">
     <w:name w:val="Normal"/>
@@ -7225,7 +7470,6 @@
   <w:style w:type="character" w:default="1" w:styleId="Fuentedeprrafopredeter">
     <w:name w:val="Default Paragraph Font"/>
     <w:uiPriority w:val="1"/>
-    <w:semiHidden/>
     <w:unhideWhenUsed/>
   </w:style>
   <w:style w:type="table" w:default="1" w:styleId="Tablanormal">
@@ -8135,7 +8379,7 @@
       <w:szCs w:val="24"/>
     </w:rPr>
   </w:style>
-  <w:style w:type="table" w:styleId="Cuadrculadetablaclara">
+  <w:style w:type="table" w:styleId="Tablaconcuadrculaclara">
     <w:name w:val="Grid Table Light"/>
     <w:basedOn w:val="Tablanormal"/>
     <w:uiPriority w:val="40"/>
@@ -8157,7 +8401,7 @@
   <w:style w:type="table" w:customStyle="1" w:styleId="Cuadrculadetablaclara1">
     <w:name w:val="Cuadrícula de tabla clara1"/>
     <w:basedOn w:val="Tablanormal"/>
-    <w:next w:val="Cuadrculadetablaclara"/>
+    <w:next w:val="Tablaconcuadrculaclara"/>
     <w:uiPriority w:val="40"/>
     <w:rsid w:val="00943DF1"/>
     <w:pPr>
@@ -8198,7 +8442,7 @@
       <w:spacing w:after="0" w:line="240" w:lineRule="auto"/>
     </w:pPr>
   </w:style>
-  <w:style w:type="character" w:styleId="Textoennegrita">
+  <w:style w:type="character" w:styleId="Fuerte">
     <w:name w:val="Strong"/>
     <w:basedOn w:val="Fuentedeprrafopredeter"/>
     <w:uiPriority w:val="22"/>
@@ -8210,532 +8454,6 @@
     </w:rPr>
   </w:style>
 </w:styles>
-</file>
-
-<file path=word/glossary/document.xml><?xml version="1.0" encoding="utf-8"?>
-<w:glossaryDocument xmlns:wpc="http://schemas.microsoft.com/office/word/2010/wordprocessingCanvas" xmlns:cx="http://schemas.microsoft.com/office/drawing/2014/chartex" xmlns:mc="http://schemas.openxmlformats.org/markup-compatibility/2006" xmlns:o="urn:schemas-microsoft-com:office:office" xmlns:r="http://schemas.openxmlformats.org/officeDocument/2006/relationships" xmlns:m="http://schemas.openxmlformats.org/officeDocument/2006/math" xmlns:v="urn:schemas-microsoft-com:vml" xmlns:wp14="http://schemas.microsoft.com/office/word/2010/wordprocessingDrawing" xmlns:wp="http://schemas.openxmlformats.org/drawingml/2006/wordprocessingDrawing" xmlns:w10="urn:schemas-microsoft-com:office:word" xmlns:w="http://schemas.openxmlformats.org/wordprocessingml/2006/main" xmlns:w14="http://schemas.microsoft.com/office/word/2010/wordml" xmlns:w15="http://schemas.microsoft.com/office/word/2012/wordml" xmlns:w16se="http://schemas.microsoft.com/office/word/2015/wordml/symex" xmlns:wpg="http://schemas.microsoft.com/office/word/2010/wordprocessingGroup" xmlns:wpi="http://schemas.microsoft.com/office/word/2010/wordprocessingInk" xmlns:wne="http://schemas.microsoft.com/office/word/2006/wordml" xmlns:wps="http://schemas.microsoft.com/office/word/2010/wordprocessingShape" mc:Ignorable="w14 w15 w16se wp14"/>
-</file>
-
-<file path=word/glossary/fontTable.xml><?xml version="1.0" encoding="utf-8"?>
-<w:fonts xmlns:mc="http://schemas.openxmlformats.org/markup-compatibility/2006" xmlns:r="http://schemas.openxmlformats.org/officeDocument/2006/relationships" xmlns:w="http://schemas.openxmlformats.org/wordprocessingml/2006/main" xmlns:w14="http://schemas.microsoft.com/office/word/2010/wordml" xmlns:w15="http://schemas.microsoft.com/office/word/2012/wordml" xmlns:w16se="http://schemas.microsoft.com/office/word/2015/wordml/symex" mc:Ignorable="w14 w15 w16se">
-  <w:font w:name="Calibri">
-    <w:panose1 w:val="020F0502020204030204"/>
-    <w:charset w:val="00"/>
-    <w:family w:val="swiss"/>
-    <w:pitch w:val="variable"/>
-    <w:sig w:usb0="E4002EFF" w:usb1="C000247B" w:usb2="00000009" w:usb3="00000000" w:csb0="000001FF" w:csb1="00000000"/>
-  </w:font>
-  <w:font w:name="Times New Roman">
-    <w:panose1 w:val="02020603050405020304"/>
-    <w:charset w:val="00"/>
-    <w:family w:val="roman"/>
-    <w:pitch w:val="variable"/>
-    <w:sig w:usb0="E0002EFF" w:usb1="C000785B" w:usb2="00000009" w:usb3="00000000" w:csb0="000001FF" w:csb1="00000000"/>
-  </w:font>
-  <w:font w:name="Courier New">
-    <w:panose1 w:val="02070309020205020404"/>
-    <w:charset w:val="00"/>
-    <w:family w:val="modern"/>
-    <w:pitch w:val="fixed"/>
-    <w:sig w:usb0="E0002EFF" w:usb1="C0007843" w:usb2="00000009" w:usb3="00000000" w:csb0="000001FF" w:csb1="00000000"/>
-  </w:font>
-  <w:font w:name="Wingdings">
-    <w:panose1 w:val="05000000000000000000"/>
-    <w:charset w:val="02"/>
-    <w:family w:val="auto"/>
-    <w:pitch w:val="variable"/>
-    <w:sig w:usb0="00000000" w:usb1="10000000" w:usb2="00000000" w:usb3="00000000" w:csb0="80000000" w:csb1="00000000"/>
-  </w:font>
-  <w:font w:name="Symbol">
-    <w:panose1 w:val="05050102010706020507"/>
-    <w:charset w:val="02"/>
-    <w:family w:val="roman"/>
-    <w:pitch w:val="variable"/>
-    <w:sig w:usb0="00000000" w:usb1="10000000" w:usb2="00000000" w:usb3="00000000" w:csb0="80000000" w:csb1="00000000"/>
-  </w:font>
-  <w:font w:name="Calibri Light">
-    <w:panose1 w:val="020F0302020204030204"/>
-    <w:charset w:val="00"/>
-    <w:family w:val="swiss"/>
-    <w:pitch w:val="variable"/>
-    <w:sig w:usb0="E4002EFF" w:usb1="C000247B" w:usb2="00000009" w:usb3="00000000" w:csb0="000001FF" w:csb1="00000000"/>
-  </w:font>
-  <w:font w:name="Segoe UI">
-    <w:panose1 w:val="020B0502040204020203"/>
-    <w:charset w:val="00"/>
-    <w:family w:val="swiss"/>
-    <w:pitch w:val="variable"/>
-    <w:sig w:usb0="E4002EFF" w:usb1="C000E47F" w:usb2="00000009" w:usb3="00000000" w:csb0="000001FF" w:csb1="00000000"/>
-  </w:font>
-  <w:font w:name="Century Gothic">
-    <w:panose1 w:val="020B0502020202020204"/>
-    <w:charset w:val="00"/>
-    <w:family w:val="swiss"/>
-    <w:pitch w:val="variable"/>
-    <w:sig w:usb0="00000287" w:usb1="00000000" w:usb2="00000000" w:usb3="00000000" w:csb0="0000009F" w:csb1="00000000"/>
-  </w:font>
-</w:fonts>
-</file>
-
-<file path=word/glossary/settings.xml><?xml version="1.0" encoding="utf-8"?>
-<w:settings xmlns:mc="http://schemas.openxmlformats.org/markup-compatibility/2006" xmlns:o="urn:schemas-microsoft-com:office:office" xmlns:r="http://schemas.openxmlformats.org/officeDocument/2006/relationships" xmlns:m="http://schemas.openxmlformats.org/officeDocument/2006/math" xmlns:v="urn:schemas-microsoft-com:vml" xmlns:w10="urn:schemas-microsoft-com:office:word" xmlns:w="http://schemas.openxmlformats.org/wordprocessingml/2006/main" xmlns:w14="http://schemas.microsoft.com/office/word/2010/wordml" xmlns:w15="http://schemas.microsoft.com/office/word/2012/wordml" xmlns:w16se="http://schemas.microsoft.com/office/word/2015/wordml/symex" xmlns:sl="http://schemas.openxmlformats.org/schemaLibrary/2006/main" mc:Ignorable="w14 w15 w16se">
-  <w:defaultTabStop w:val="708"/>
-  <w:hyphenationZone w:val="425"/>
-  <w:characterSpacingControl w:val="doNotCompress"/>
-  <w:compat>
-    <w:useFELayout/>
-    <w:compatSetting w:name="compatibilityMode" w:uri="http://schemas.microsoft.com/office/word" w:val="12"/>
-  </w:compat>
-  <w:rsids>
-    <w:rsidRoot w:val="008F14D6"/>
-    <w:rsid w:val="008F14D6"/>
-  </w:rsids>
-  <m:mathPr>
-    <m:mathFont m:val="Cambria Math"/>
-    <m:brkBin m:val="before"/>
-    <m:brkBinSub m:val="--"/>
-    <m:smallFrac m:val="0"/>
-    <m:dispDef/>
-    <m:lMargin m:val="0"/>
-    <m:rMargin m:val="0"/>
-    <m:defJc m:val="centerGroup"/>
-    <m:wrapIndent m:val="1440"/>
-    <m:intLim m:val="subSup"/>
-    <m:naryLim m:val="undOvr"/>
-  </m:mathPr>
-  <w:themeFontLang w:val="es-CL"/>
-  <w:clrSchemeMapping w:bg1="light1" w:t1="dark1" w:bg2="light2" w:t2="dark2" w:accent1="accent1" w:accent2="accent2" w:accent3="accent3" w:accent4="accent4" w:accent5="accent5" w:accent6="accent6" w:hyperlink="hyperlink" w:followedHyperlink="followedHyperlink"/>
-  <w:decimalSymbol w:val=","/>
-  <w:listSeparator w:val=";"/>
-</w:settings>
-</file>
-
-<file path=word/glossary/styles.xml><?xml version="1.0" encoding="utf-8"?>
-<w:styles xmlns:mc="http://schemas.openxmlformats.org/markup-compatibility/2006" xmlns:r="http://schemas.openxmlformats.org/officeDocument/2006/relationships" xmlns:w="http://schemas.openxmlformats.org/wordprocessingml/2006/main" xmlns:w14="http://schemas.microsoft.com/office/word/2010/wordml" xmlns:w15="http://schemas.microsoft.com/office/word/2012/wordml" xmlns:w16se="http://schemas.microsoft.com/office/word/2015/wordml/symex" mc:Ignorable="w14 w15 w16se">
-  <w:docDefaults>
-    <w:rPrDefault>
-      <w:rPr>
-        <w:rFonts w:asciiTheme="minorHAnsi" w:eastAsiaTheme="minorEastAsia" w:hAnsiTheme="minorHAnsi" w:cstheme="minorBidi"/>
-        <w:sz w:val="22"/>
-        <w:szCs w:val="22"/>
-        <w:lang w:val="es-CL" w:eastAsia="es-CL" w:bidi="ar-SA"/>
-      </w:rPr>
-    </w:rPrDefault>
-    <w:pPrDefault>
-      <w:pPr>
-        <w:spacing w:after="160" w:line="259" w:lineRule="auto"/>
-      </w:pPr>
-    </w:pPrDefault>
-  </w:docDefaults>
-  <w:latentStyles w:defLockedState="0" w:defUIPriority="99" w:defSemiHidden="0" w:defUnhideWhenUsed="0" w:defQFormat="0" w:count="371">
-    <w:lsdException w:name="Normal" w:uiPriority="0" w:qFormat="1"/>
-    <w:lsdException w:name="heading 1" w:uiPriority="9" w:qFormat="1"/>
-    <w:lsdException w:name="heading 2" w:semiHidden="1" w:uiPriority="9" w:unhideWhenUsed="1" w:qFormat="1"/>
-    <w:lsdException w:name="heading 3" w:semiHidden="1" w:uiPriority="9" w:unhideWhenUsed="1" w:qFormat="1"/>
-    <w:lsdException w:name="heading 4" w:semiHidden="1" w:uiPriority="9" w:unhideWhenUsed="1" w:qFormat="1"/>
-    <w:lsdException w:name="heading 5" w:semiHidden="1" w:uiPriority="9" w:unhideWhenUsed="1" w:qFormat="1"/>
-    <w:lsdException w:name="heading 6" w:semiHidden="1" w:uiPriority="9" w:unhideWhenUsed="1" w:qFormat="1"/>
-    <w:lsdException w:name="heading 7" w:semiHidden="1" w:uiPriority="9" w:unhideWhenUsed="1" w:qFormat="1"/>
-    <w:lsdException w:name="heading 8" w:semiHidden="1" w:uiPriority="9" w:unhideWhenUsed="1" w:qFormat="1"/>
-    <w:lsdException w:name="heading 9" w:semiHidden="1" w:uiPriority="9" w:unhideWhenUsed="1" w:qFormat="1"/>
-    <w:lsdException w:name="index 1" w:semiHidden="1" w:unhideWhenUsed="1"/>
-    <w:lsdException w:name="index 2" w:semiHidden="1" w:unhideWhenUsed="1"/>
-    <w:lsdException w:name="index 3" w:semiHidden="1" w:unhideWhenUsed="1"/>
-    <w:lsdException w:name="index 4" w:semiHidden="1" w:unhideWhenUsed="1"/>
-    <w:lsdException w:name="index 5" w:semiHidden="1" w:unhideWhenUsed="1"/>
-    <w:lsdException w:name="index 6" w:semiHidden="1" w:unhideWhenUsed="1"/>
-    <w:lsdException w:name="index 7" w:semiHidden="1" w:unhideWhenUsed="1"/>
-    <w:lsdException w:name="index 8" w:semiHidden="1" w:unhideWhenUsed="1"/>
-    <w:lsdException w:name="index 9" w:semiHidden="1" w:unhideWhenUsed="1"/>
-    <w:lsdException w:name="toc 1" w:semiHidden="1" w:uiPriority="39" w:unhideWhenUsed="1"/>
-    <w:lsdException w:name="toc 2" w:semiHidden="1" w:uiPriority="39" w:unhideWhenUsed="1"/>
-    <w:lsdException w:name="toc 3" w:semiHidden="1" w:uiPriority="39" w:unhideWhenUsed="1"/>
-    <w:lsdException w:name="toc 4" w:semiHidden="1" w:uiPriority="39" w:unhideWhenUsed="1"/>
-    <w:lsdException w:name="toc 5" w:semiHidden="1" w:uiPriority="39" w:unhideWhenUsed="1"/>
-    <w:lsdException w:name="toc 6" w:semiHidden="1" w:uiPriority="39" w:unhideWhenUsed="1"/>
-    <w:lsdException w:name="toc 7" w:semiHidden="1" w:uiPriority="39" w:unhideWhenUsed="1"/>
-    <w:lsdException w:name="toc 8" w:semiHidden="1" w:uiPriority="39" w:unhideWhenUsed="1"/>
-    <w:lsdException w:name="toc 9" w:semiHidden="1" w:uiPriority="39" w:unhideWhenUsed="1"/>
-    <w:lsdException w:name="Normal Indent" w:semiHidden="1" w:unhideWhenUsed="1"/>
-    <w:lsdException w:name="footnote text" w:semiHidden="1" w:unhideWhenUsed="1"/>
-    <w:lsdException w:name="annotation text" w:semiHidden="1" w:unhideWhenUsed="1"/>
-    <w:lsdException w:name="header" w:semiHidden="1" w:unhideWhenUsed="1"/>
-    <w:lsdException w:name="footer" w:semiHidden="1" w:unhideWhenUsed="1"/>
-    <w:lsdException w:name="index heading" w:semiHidden="1" w:unhideWhenUsed="1"/>
-    <w:lsdException w:name="caption" w:semiHidden="1" w:uiPriority="35" w:unhideWhenUsed="1" w:qFormat="1"/>
-    <w:lsdException w:name="table of figures" w:semiHidden="1" w:unhideWhenUsed="1"/>
-    <w:lsdException w:name="envelope address" w:semiHidden="1" w:unhideWhenUsed="1"/>
-    <w:lsdException w:name="envelope return" w:semiHidden="1" w:unhideWhenUsed="1"/>
-    <w:lsdException w:name="footnote reference" w:semiHidden="1" w:unhideWhenUsed="1"/>
-    <w:lsdException w:name="annotation reference" w:semiHidden="1" w:unhideWhenUsed="1"/>
-    <w:lsdException w:name="line number" w:semiHidden="1" w:unhideWhenUsed="1"/>
-    <w:lsdException w:name="page number" w:semiHidden="1" w:unhideWhenUsed="1"/>
-    <w:lsdException w:name="endnote reference" w:semiHidden="1" w:unhideWhenUsed="1"/>
-    <w:lsdException w:name="endnote text" w:semiHidden="1" w:unhideWhenUsed="1"/>
-    <w:lsdException w:name="table of authorities" w:semiHidden="1" w:unhideWhenUsed="1"/>
-    <w:lsdException w:name="macro" w:semiHidden="1" w:unhideWhenUsed="1"/>
-    <w:lsdException w:name="toa heading" w:semiHidden="1" w:unhideWhenUsed="1"/>
-    <w:lsdException w:name="List" w:semiHidden="1" w:unhideWhenUsed="1"/>
-    <w:lsdException w:name="List Bullet" w:semiHidden="1" w:unhideWhenUsed="1"/>
-    <w:lsdException w:name="List Number" w:semiHidden="1" w:unhideWhenUsed="1"/>
-    <w:lsdException w:name="List 2" w:semiHidden="1" w:unhideWhenUsed="1"/>
-    <w:lsdException w:name="List 3" w:semiHidden="1" w:unhideWhenUsed="1"/>
-    <w:lsdException w:name="List 4" w:semiHidden="1" w:unhideWhenUsed="1"/>
-    <w:lsdException w:name="List 5" w:semiHidden="1" w:unhideWhenUsed="1"/>
-    <w:lsdException w:name="List Bullet 2" w:semiHidden="1" w:unhideWhenUsed="1"/>
-    <w:lsdException w:name="List Bullet 3" w:semiHidden="1" w:unhideWhenUsed="1"/>
-    <w:lsdException w:name="List Bullet 4" w:semiHidden="1" w:unhideWhenUsed="1"/>
-    <w:lsdException w:name="List Bullet 5" w:semiHidden="1" w:unhideWhenUsed="1"/>
-    <w:lsdException w:name="List Number 2" w:semiHidden="1" w:unhideWhenUsed="1"/>
-    <w:lsdException w:name="List Number 3" w:semiHidden="1" w:unhideWhenUsed="1"/>
-    <w:lsdException w:name="List Number 4" w:semiHidden="1" w:unhideWhenUsed="1"/>
-    <w:lsdException w:name="List Number 5" w:semiHidden="1" w:unhideWhenUsed="1"/>
-    <w:lsdException w:name="Title" w:uiPriority="10" w:qFormat="1"/>
-    <w:lsdException w:name="Closing" w:semiHidden="1" w:unhideWhenUsed="1"/>
-    <w:lsdException w:name="Signature" w:semiHidden="1" w:unhideWhenUsed="1"/>
-    <w:lsdException w:name="Default Paragraph Font" w:semiHidden="1" w:uiPriority="1" w:unhideWhenUsed="1"/>
-    <w:lsdException w:name="Body Text" w:semiHidden="1" w:unhideWhenUsed="1"/>
-    <w:lsdException w:name="Body Text Indent" w:semiHidden="1" w:unhideWhenUsed="1"/>
-    <w:lsdException w:name="List Continue" w:semiHidden="1" w:unhideWhenUsed="1"/>
-    <w:lsdException w:name="List Continue 2" w:semiHidden="1" w:unhideWhenUsed="1"/>
-    <w:lsdException w:name="List Continue 3" w:semiHidden="1" w:unhideWhenUsed="1"/>
-    <w:lsdException w:name="List Continue 4" w:semiHidden="1" w:unhideWhenUsed="1"/>
-    <w:lsdException w:name="List Continue 5" w:semiHidden="1" w:unhideWhenUsed="1"/>
-    <w:lsdException w:name="Message Header" w:semiHidden="1" w:unhideWhenUsed="1"/>
-    <w:lsdException w:name="Subtitle" w:uiPriority="11" w:qFormat="1"/>
-    <w:lsdException w:name="Salutation" w:semiHidden="1" w:unhideWhenUsed="1"/>
-    <w:lsdException w:name="Date" w:semiHidden="1" w:unhideWhenUsed="1"/>
-    <w:lsdException w:name="Body Text First Indent" w:semiHidden="1" w:unhideWhenUsed="1"/>
-    <w:lsdException w:name="Body Text First Indent 2" w:semiHidden="1" w:unhideWhenUsed="1"/>
-    <w:lsdException w:name="Note Heading" w:semiHidden="1" w:unhideWhenUsed="1"/>
-    <w:lsdException w:name="Body Text 2" w:semiHidden="1" w:unhideWhenUsed="1"/>
-    <w:lsdException w:name="Body Text 3" w:semiHidden="1" w:unhideWhenUsed="1"/>
-    <w:lsdException w:name="Body Text Indent 2" w:semiHidden="1" w:unhideWhenUsed="1"/>
-    <w:lsdException w:name="Body Text Indent 3" w:semiHidden="1" w:unhideWhenUsed="1"/>
-    <w:lsdException w:name="Block Text" w:semiHidden="1" w:unhideWhenUsed="1"/>
-    <w:lsdException w:name="Hyperlink" w:semiHidden="1" w:unhideWhenUsed="1"/>
-    <w:lsdException w:name="FollowedHyperlink" w:semiHidden="1" w:unhideWhenUsed="1"/>
-    <w:lsdException w:name="Strong" w:uiPriority="22" w:qFormat="1"/>
-    <w:lsdException w:name="Emphasis" w:uiPriority="20" w:qFormat="1"/>
-    <w:lsdException w:name="Document Map" w:semiHidden="1" w:unhideWhenUsed="1"/>
-    <w:lsdException w:name="Plain Text" w:semiHidden="1" w:unhideWhenUsed="1"/>
-    <w:lsdException w:name="E-mail Signature" w:semiHidden="1" w:unhideWhenUsed="1"/>
-    <w:lsdException w:name="HTML Top of Form" w:semiHidden="1" w:unhideWhenUsed="1"/>
-    <w:lsdException w:name="HTML Bottom of Form" w:semiHidden="1" w:unhideWhenUsed="1"/>
-    <w:lsdException w:name="Normal (Web)" w:semiHidden="1" w:unhideWhenUsed="1"/>
-    <w:lsdException w:name="HTML Acronym" w:semiHidden="1" w:unhideWhenUsed="1"/>
-    <w:lsdException w:name="HTML Address" w:semiHidden="1" w:unhideWhenUsed="1"/>
-    <w:lsdException w:name="HTML Cite" w:semiHidden="1" w:unhideWhenUsed="1"/>
-    <w:lsdException w:name="HTML Code" w:semiHidden="1" w:unhideWhenUsed="1"/>
-    <w:lsdException w:name="HTML Definition" w:semiHidden="1" w:unhideWhenUsed="1"/>
-    <w:lsdException w:name="HTML Keyboard" w:semiHidden="1" w:unhideWhenUsed="1"/>
-    <w:lsdException w:name="HTML Preformatted" w:semiHidden="1" w:unhideWhenUsed="1"/>
-    <w:lsdException w:name="HTML Sample" w:semiHidden="1" w:unhideWhenUsed="1"/>
-    <w:lsdException w:name="HTML Typewriter" w:semiHidden="1" w:unhideWhenUsed="1"/>
-    <w:lsdException w:name="HTML Variable" w:semiHidden="1" w:unhideWhenUsed="1"/>
-    <w:lsdException w:name="Normal Table" w:semiHidden="1" w:unhideWhenUsed="1"/>
-    <w:lsdException w:name="annotation subject" w:semiHidden="1" w:unhideWhenUsed="1"/>
-    <w:lsdException w:name="No List" w:semiHidden="1" w:unhideWhenUsed="1"/>
-    <w:lsdException w:name="Outline List 1" w:semiHidden="1" w:unhideWhenUsed="1"/>
-    <w:lsdException w:name="Outline List 2" w:semiHidden="1" w:unhideWhenUsed="1"/>
-    <w:lsdException w:name="Outline List 3" w:semiHidden="1" w:unhideWhenUsed="1"/>
-    <w:lsdException w:name="Table Simple 1" w:semiHidden="1" w:unhideWhenUsed="1"/>
-    <w:lsdException w:name="Table Simple 2" w:semiHidden="1" w:unhideWhenUsed="1"/>
-    <w:lsdException w:name="Table Simple 3" w:semiHidden="1" w:unhideWhenUsed="1"/>
-    <w:lsdException w:name="Table Classic 1" w:semiHidden="1" w:unhideWhenUsed="1"/>
-    <w:lsdException w:name="Table Classic 2" w:semiHidden="1" w:unhideWhenUsed="1"/>
-    <w:lsdException w:name="Table Classic 3" w:semiHidden="1" w:unhideWhenUsed="1"/>
-    <w:lsdException w:name="Table Classic 4" w:semiHidden="1" w:unhideWhenUsed="1"/>
-    <w:lsdException w:name="Table Colorful 1" w:semiHidden="1" w:unhideWhenUsed="1"/>
-    <w:lsdException w:name="Table Colorful 2" w:semiHidden="1" w:unhideWhenUsed="1"/>
-    <w:lsdException w:name="Table Colorful 3" w:semiHidden="1" w:unhideWhenUsed="1"/>
-    <w:lsdException w:name="Table Columns 1" w:semiHidden="1" w:unhideWhenUsed="1"/>
-    <w:lsdException w:name="Table Columns 2" w:semiHidden="1" w:unhideWhenUsed="1"/>
-    <w:lsdException w:name="Table Columns 3" w:semiHidden="1" w:unhideWhenUsed="1"/>
-    <w:lsdException w:name="Table Columns 4" w:semiHidden="1" w:unhideWhenUsed="1"/>
-    <w:lsdException w:name="Table Columns 5" w:semiHidden="1" w:unhideWhenUsed="1"/>
-    <w:lsdException w:name="Table Grid 1" w:semiHidden="1" w:unhideWhenUsed="1"/>
-    <w:lsdException w:name="Table Grid 2" w:semiHidden="1" w:unhideWhenUsed="1"/>
-    <w:lsdException w:name="Table Grid 3" w:semiHidden="1" w:unhideWhenUsed="1"/>
-    <w:lsdException w:name="Table Grid 4" w:semiHidden="1" w:unhideWhenUsed="1"/>
-    <w:lsdException w:name="Table Grid 5" w:semiHidden="1" w:unhideWhenUsed="1"/>
-    <w:lsdException w:name="Table Grid 6" w:semiHidden="1" w:unhideWhenUsed="1"/>
-    <w:lsdException w:name="Table Grid 7" w:semiHidden="1" w:unhideWhenUsed="1"/>
-    <w:lsdException w:name="Table Grid 8" w:semiHidden="1" w:unhideWhenUsed="1"/>
-    <w:lsdException w:name="Table List 1" w:semiHidden="1" w:unhideWhenUsed="1"/>
-    <w:lsdException w:name="Table List 2" w:semiHidden="1" w:unhideWhenUsed="1"/>
-    <w:lsdException w:name="Table List 3" w:semiHidden="1" w:unhideWhenUsed="1"/>
-    <w:lsdException w:name="Table List 4" w:semiHidden="1" w:unhideWhenUsed="1"/>
-    <w:lsdException w:name="Table List 5" w:semiHidden="1" w:unhideWhenUsed="1"/>
-    <w:lsdException w:name="Table List 6" w:semiHidden="1" w:unhideWhenUsed="1"/>
-    <w:lsdException w:name="Table List 7" w:semiHidden="1" w:unhideWhenUsed="1"/>
-    <w:lsdException w:name="Table List 8" w:semiHidden="1" w:unhideWhenUsed="1"/>
-    <w:lsdException w:name="Table 3D effects 1" w:semiHidden="1" w:unhideWhenUsed="1"/>
-    <w:lsdException w:name="Table 3D effects 2" w:semiHidden="1" w:unhideWhenUsed="1"/>
-    <w:lsdException w:name="Table 3D effects 3" w:semiHidden="1" w:unhideWhenUsed="1"/>
-    <w:lsdException w:name="Table Contemporary" w:semiHidden="1" w:unhideWhenUsed="1"/>
-    <w:lsdException w:name="Table Elegant" w:semiHidden="1" w:unhideWhenUsed="1"/>
-    <w:lsdException w:name="Table Professional" w:semiHidden="1" w:unhideWhenUsed="1"/>
-    <w:lsdException w:name="Table Subtle 1" w:semiHidden="1" w:unhideWhenUsed="1"/>
-    <w:lsdException w:name="Table Subtle 2" w:semiHidden="1" w:unhideWhenUsed="1"/>
-    <w:lsdException w:name="Table Web 1" w:semiHidden="1" w:unhideWhenUsed="1"/>
-    <w:lsdException w:name="Table Web 2" w:semiHidden="1" w:unhideWhenUsed="1"/>
-    <w:lsdException w:name="Table Web 3" w:semiHidden="1" w:unhideWhenUsed="1"/>
-    <w:lsdException w:name="Balloon Text" w:semiHidden="1" w:unhideWhenUsed="1"/>
-    <w:lsdException w:name="Table Grid" w:uiPriority="39"/>
-    <w:lsdException w:name="Table Theme" w:semiHidden="1" w:unhideWhenUsed="1"/>
-    <w:lsdException w:name="Placeholder Text" w:semiHidden="1"/>
-    <w:lsdException w:name="No Spacing" w:uiPriority="1" w:qFormat="1"/>
-    <w:lsdException w:name="Light Shading" w:uiPriority="60"/>
-    <w:lsdException w:name="Light List" w:uiPriority="61"/>
-    <w:lsdException w:name="Light Grid" w:uiPriority="62"/>
-    <w:lsdException w:name="Medium Shading 1" w:uiPriority="63"/>
-    <w:lsdException w:name="Medium Shading 2" w:uiPriority="64"/>
-    <w:lsdException w:name="Medium List 1" w:uiPriority="65"/>
-    <w:lsdException w:name="Medium List 2" w:uiPriority="66"/>
-    <w:lsdException w:name="Medium Grid 1" w:uiPriority="67"/>
-    <w:lsdException w:name="Medium Grid 2" w:uiPriority="68"/>
-    <w:lsdException w:name="Medium Grid 3" w:uiPriority="69"/>
-    <w:lsdException w:name="Dark List" w:uiPriority="70"/>
-    <w:lsdException w:name="Colorful Shading" w:uiPriority="71"/>
-    <w:lsdException w:name="Colorful List" w:uiPriority="72"/>
-    <w:lsdException w:name="Colorful Grid" w:uiPriority="73"/>
-    <w:lsdException w:name="Light Shading Accent 1" w:uiPriority="60"/>
-    <w:lsdException w:name="Light List Accent 1" w:uiPriority="61"/>
-    <w:lsdException w:name="Light Grid Accent 1" w:uiPriority="62"/>
-    <w:lsdException w:name="Medium Shading 1 Accent 1" w:uiPriority="63"/>
-    <w:lsdException w:name="Medium Shading 2 Accent 1" w:uiPriority="64"/>
-    <w:lsdException w:name="Medium List 1 Accent 1" w:uiPriority="65"/>
-    <w:lsdException w:name="Revision" w:semiHidden="1"/>
-    <w:lsdException w:name="List Paragraph" w:uiPriority="34" w:qFormat="1"/>
-    <w:lsdException w:name="Quote" w:uiPriority="29" w:qFormat="1"/>
-    <w:lsdException w:name="Intense Quote" w:uiPriority="30" w:qFormat="1"/>
-    <w:lsdException w:name="Medium List 2 Accent 1" w:uiPriority="66"/>
-    <w:lsdException w:name="Medium Grid 1 Accent 1" w:uiPriority="67"/>
-    <w:lsdException w:name="Medium Grid 2 Accent 1" w:uiPriority="68"/>
-    <w:lsdException w:name="Medium Grid 3 Accent 1" w:uiPriority="69"/>
-    <w:lsdException w:name="Dark List Accent 1" w:uiPriority="70"/>
-    <w:lsdException w:name="Colorful Shading Accent 1" w:uiPriority="71"/>
-    <w:lsdException w:name="Colorful List Accent 1" w:uiPriority="72"/>
-    <w:lsdException w:name="Colorful Grid Accent 1" w:uiPriority="73"/>
-    <w:lsdException w:name="Light Shading Accent 2" w:uiPriority="60"/>
-    <w:lsdException w:name="Light List Accent 2" w:uiPriority="61"/>
-    <w:lsdException w:name="Light Grid Accent 2" w:uiPriority="62"/>
-    <w:lsdException w:name="Medium Shading 1 Accent 2" w:uiPriority="63"/>
-    <w:lsdException w:name="Medium Shading 2 Accent 2" w:uiPriority="64"/>
-    <w:lsdException w:name="Medium List 1 Accent 2" w:uiPriority="65"/>
-    <w:lsdException w:name="Medium List 2 Accent 2" w:uiPriority="66"/>
-    <w:lsdException w:name="Medium Grid 1 Accent 2" w:uiPriority="67"/>
-    <w:lsdException w:name="Medium Grid 2 Accent 2" w:uiPriority="68"/>
-    <w:lsdException w:name="Medium Grid 3 Accent 2" w:uiPriority="69"/>
-    <w:lsdException w:name="Dark List Accent 2" w:uiPriority="70"/>
-    <w:lsdException w:name="Colorful Shading Accent 2" w:uiPriority="71"/>
-    <w:lsdException w:name="Colorful List Accent 2" w:uiPriority="72"/>
-    <w:lsdException w:name="Colorful Grid Accent 2" w:uiPriority="73"/>
-    <w:lsdException w:name="Light Shading Accent 3" w:uiPriority="60"/>
-    <w:lsdException w:name="Light List Accent 3" w:uiPriority="61"/>
-    <w:lsdException w:name="Light Grid Accent 3" w:uiPriority="62"/>
-    <w:lsdException w:name="Medium Shading 1 Accent 3" w:uiPriority="63"/>
-    <w:lsdException w:name="Medium Shading 2 Accent 3" w:uiPriority="64"/>
-    <w:lsdException w:name="Medium List 1 Accent 3" w:uiPriority="65"/>
-    <w:lsdException w:name="Medium List 2 Accent 3" w:uiPriority="66"/>
-    <w:lsdException w:name="Medium Grid 1 Accent 3" w:uiPriority="67"/>
-    <w:lsdException w:name="Medium Grid 2 Accent 3" w:uiPriority="68"/>
-    <w:lsdException w:name="Medium Grid 3 Accent 3" w:uiPriority="69"/>
-    <w:lsdException w:name="Dark List Accent 3" w:uiPriority="70"/>
-    <w:lsdException w:name="Colorful Shading Accent 3" w:uiPriority="71"/>
-    <w:lsdException w:name="Colorful List Accent 3" w:uiPriority="72"/>
-    <w:lsdException w:name="Colorful Grid Accent 3" w:uiPriority="73"/>
-    <w:lsdException w:name="Light Shading Accent 4" w:uiPriority="60"/>
-    <w:lsdException w:name="Light List Accent 4" w:uiPriority="61"/>
-    <w:lsdException w:name="Light Grid Accent 4" w:uiPriority="62"/>
-    <w:lsdException w:name="Medium Shading 1 Accent 4" w:uiPriority="63"/>
-    <w:lsdException w:name="Medium Shading 2 Accent 4" w:uiPriority="64"/>
-    <w:lsdException w:name="Medium List 1 Accent 4" w:uiPriority="65"/>
-    <w:lsdException w:name="Medium List 2 Accent 4" w:uiPriority="66"/>
-    <w:lsdException w:name="Medium Grid 1 Accent 4" w:uiPriority="67"/>
-    <w:lsdException w:name="Medium Grid 2 Accent 4" w:uiPriority="68"/>
-    <w:lsdException w:name="Medium Grid 3 Accent 4" w:uiPriority="69"/>
-    <w:lsdException w:name="Dark List Accent 4" w:uiPriority="70"/>
-    <w:lsdException w:name="Colorful Shading Accent 4" w:uiPriority="71"/>
-    <w:lsdException w:name="Colorful List Accent 4" w:uiPriority="72"/>
-    <w:lsdException w:name="Colorful Grid Accent 4" w:uiPriority="73"/>
-    <w:lsdException w:name="Light Shading Accent 5" w:uiPriority="60"/>
-    <w:lsdException w:name="Light List Accent 5" w:uiPriority="61"/>
-    <w:lsdException w:name="Light Grid Accent 5" w:uiPriority="62"/>
-    <w:lsdException w:name="Medium Shading 1 Accent 5" w:uiPriority="63"/>
-    <w:lsdException w:name="Medium Shading 2 Accent 5" w:uiPriority="64"/>
-    <w:lsdException w:name="Medium List 1 Accent 5" w:uiPriority="65"/>
-    <w:lsdException w:name="Medium List 2 Accent 5" w:uiPriority="66"/>
-    <w:lsdException w:name="Medium Grid 1 Accent 5" w:uiPriority="67"/>
-    <w:lsdException w:name="Medium Grid 2 Accent 5" w:uiPriority="68"/>
-    <w:lsdException w:name="Medium Grid 3 Accent 5" w:uiPriority="69"/>
-    <w:lsdException w:name="Dark List Accent 5" w:uiPriority="70"/>
-    <w:lsdException w:name="Colorful Shading Accent 5" w:uiPriority="71"/>
-    <w:lsdException w:name="Colorful List Accent 5" w:uiPriority="72"/>
-    <w:lsdException w:name="Colorful Grid Accent 5" w:uiPriority="73"/>
-    <w:lsdException w:name="Light Shading Accent 6" w:uiPriority="60"/>
-    <w:lsdException w:name="Light List Accent 6" w:uiPriority="61"/>
-    <w:lsdException w:name="Light Grid Accent 6" w:uiPriority="62"/>
-    <w:lsdException w:name="Medium Shading 1 Accent 6" w:uiPriority="63"/>
-    <w:lsdException w:name="Medium Shading 2 Accent 6" w:uiPriority="64"/>
-    <w:lsdException w:name="Medium List 1 Accent 6" w:uiPriority="65"/>
-    <w:lsdException w:name="Medium List 2 Accent 6" w:uiPriority="66"/>
-    <w:lsdException w:name="Medium Grid 1 Accent 6" w:uiPriority="67"/>
-    <w:lsdException w:name="Medium Grid 2 Accent 6" w:uiPriority="68"/>
-    <w:lsdException w:name="Medium Grid 3 Accent 6" w:uiPriority="69"/>
-    <w:lsdException w:name="Dark List Accent 6" w:uiPriority="70"/>
-    <w:lsdException w:name="Colorful Shading Accent 6" w:uiPriority="71"/>
-    <w:lsdException w:name="Colorful List Accent 6" w:uiPriority="72"/>
-    <w:lsdException w:name="Colorful Grid Accent 6" w:uiPriority="73"/>
-    <w:lsdException w:name="Subtle Emphasis" w:uiPriority="19" w:qFormat="1"/>
-    <w:lsdException w:name="Intense Emphasis" w:uiPriority="21" w:qFormat="1"/>
-    <w:lsdException w:name="Subtle Reference" w:uiPriority="31" w:qFormat="1"/>
-    <w:lsdException w:name="Intense Reference" w:uiPriority="32" w:qFormat="1"/>
-    <w:lsdException w:name="Book Title" w:uiPriority="33" w:qFormat="1"/>
-    <w:lsdException w:name="Bibliography" w:semiHidden="1" w:uiPriority="37" w:unhideWhenUsed="1"/>
-    <w:lsdException w:name="TOC Heading" w:semiHidden="1" w:uiPriority="39" w:unhideWhenUsed="1" w:qFormat="1"/>
-    <w:lsdException w:name="Plain Table 1" w:uiPriority="41"/>
-    <w:lsdException w:name="Plain Table 2" w:uiPriority="42"/>
-    <w:lsdException w:name="Plain Table 3" w:uiPriority="43"/>
-    <w:lsdException w:name="Plain Table 4" w:uiPriority="44"/>
-    <w:lsdException w:name="Plain Table 5" w:uiPriority="45"/>
-    <w:lsdException w:name="Grid Table Light" w:uiPriority="40"/>
-    <w:lsdException w:name="Grid Table 1 Light" w:uiPriority="46"/>
-    <w:lsdException w:name="Grid Table 2" w:uiPriority="47"/>
-    <w:lsdException w:name="Grid Table 3" w:uiPriority="48"/>
-    <w:lsdException w:name="Grid Table 4" w:uiPriority="49"/>
-    <w:lsdException w:name="Grid Table 5 Dark" w:uiPriority="50"/>
-    <w:lsdException w:name="Grid Table 6 Colorful" w:uiPriority="51"/>
-    <w:lsdException w:name="Grid Table 7 Colorful" w:uiPriority="52"/>
-    <w:lsdException w:name="Grid Table 1 Light Accent 1" w:uiPriority="46"/>
-    <w:lsdException w:name="Grid Table 2 Accent 1" w:uiPriority="47"/>
-    <w:lsdException w:name="Grid Table 3 Accent 1" w:uiPriority="48"/>
-    <w:lsdException w:name="Grid Table 4 Accent 1" w:uiPriority="49"/>
-    <w:lsdException w:name="Grid Table 5 Dark Accent 1" w:uiPriority="50"/>
-    <w:lsdException w:name="Grid Table 6 Colorful Accent 1" w:uiPriority="51"/>
-    <w:lsdException w:name="Grid Table 7 Colorful Accent 1" w:uiPriority="52"/>
-    <w:lsdException w:name="Grid Table 1 Light Accent 2" w:uiPriority="46"/>
-    <w:lsdException w:name="Grid Table 2 Accent 2" w:uiPriority="47"/>
-    <w:lsdException w:name="Grid Table 3 Accent 2" w:uiPriority="48"/>
-    <w:lsdException w:name="Grid Table 4 Accent 2" w:uiPriority="49"/>
-    <w:lsdException w:name="Grid Table 5 Dark Accent 2" w:uiPriority="50"/>
-    <w:lsdException w:name="Grid Table 6 Colorful Accent 2" w:uiPriority="51"/>
-    <w:lsdException w:name="Grid Table 7 Colorful Accent 2" w:uiPriority="52"/>
-    <w:lsdException w:name="Grid Table 1 Light Accent 3" w:uiPriority="46"/>
-    <w:lsdException w:name="Grid Table 2 Accent 3" w:uiPriority="47"/>
-    <w:lsdException w:name="Grid Table 3 Accent 3" w:uiPriority="48"/>
-    <w:lsdException w:name="Grid Table 4 Accent 3" w:uiPriority="49"/>
-    <w:lsdException w:name="Grid Table 5 Dark Accent 3" w:uiPriority="50"/>
-    <w:lsdException w:name="Grid Table 6 Colorful Accent 3" w:uiPriority="51"/>
-    <w:lsdException w:name="Grid Table 7 Colorful Accent 3" w:uiPriority="52"/>
-    <w:lsdException w:name="Grid Table 1 Light Accent 4" w:uiPriority="46"/>
-    <w:lsdException w:name="Grid Table 2 Accent 4" w:uiPriority="47"/>
-    <w:lsdException w:name="Grid Table 3 Accent 4" w:uiPriority="48"/>
-    <w:lsdException w:name="Grid Table 4 Accent 4" w:uiPriority="49"/>
-    <w:lsdException w:name="Grid Table 5 Dark Accent 4" w:uiPriority="50"/>
-    <w:lsdException w:name="Grid Table 6 Colorful Accent 4" w:uiPriority="51"/>
-    <w:lsdException w:name="Grid Table 7 Colorful Accent 4" w:uiPriority="52"/>
-    <w:lsdException w:name="Grid Table 1 Light Accent 5" w:uiPriority="46"/>
-    <w:lsdException w:name="Grid Table 2 Accent 5" w:uiPriority="47"/>
-    <w:lsdException w:name="Grid Table 3 Accent 5" w:uiPriority="48"/>
-    <w:lsdException w:name="Grid Table 4 Accent 5" w:uiPriority="49"/>
-    <w:lsdException w:name="Grid Table 5 Dark Accent 5" w:uiPriority="50"/>
-    <w:lsdException w:name="Grid Table 6 Colorful Accent 5" w:uiPriority="51"/>
-    <w:lsdException w:name="Grid Table 7 Colorful Accent 5" w:uiPriority="52"/>
-    <w:lsdException w:name="Grid Table 1 Light Accent 6" w:uiPriority="46"/>
-    <w:lsdException w:name="Grid Table 2 Accent 6" w:uiPriority="47"/>
-    <w:lsdException w:name="Grid Table 3 Accent 6" w:uiPriority="48"/>
-    <w:lsdException w:name="Grid Table 4 Accent 6" w:uiPriority="49"/>
-    <w:lsdException w:name="Grid Table 5 Dark Accent 6" w:uiPriority="50"/>
-    <w:lsdException w:name="Grid Table 6 Colorful Accent 6" w:uiPriority="51"/>
-    <w:lsdException w:name="Grid Table 7 Colorful Accent 6" w:uiPriority="52"/>
-    <w:lsdException w:name="List Table 1 Light" w:uiPriority="46"/>
-    <w:lsdException w:name="List Table 2" w:uiPriority="47"/>
-    <w:lsdException w:name="List Table 3" w:uiPriority="48"/>
-    <w:lsdException w:name="List Table 4" w:uiPriority="49"/>
-    <w:lsdException w:name="List Table 5 Dark" w:uiPriority="50"/>
-    <w:lsdException w:name="List Table 6 Colorful" w:uiPriority="51"/>
-    <w:lsdException w:name="List Table 7 Colorful" w:uiPriority="52"/>
-    <w:lsdException w:name="List Table 1 Light Accent 1" w:uiPriority="46"/>
-    <w:lsdException w:name="List Table 2 Accent 1" w:uiPriority="47"/>
-    <w:lsdException w:name="List Table 3 Accent 1" w:uiPriority="48"/>
-    <w:lsdException w:name="List Table 4 Accent 1" w:uiPriority="49"/>
-    <w:lsdException w:name="List Table 5 Dark Accent 1" w:uiPriority="50"/>
-    <w:lsdException w:name="List Table 6 Colorful Accent 1" w:uiPriority="51"/>
-    <w:lsdException w:name="List Table 7 Colorful Accent 1" w:uiPriority="52"/>
-    <w:lsdException w:name="List Table 1 Light Accent 2" w:uiPriority="46"/>
-    <w:lsdException w:name="List Table 2 Accent 2" w:uiPriority="47"/>
-    <w:lsdException w:name="List Table 3 Accent 2" w:uiPriority="48"/>
-    <w:lsdException w:name="List Table 4 Accent 2" w:uiPriority="49"/>
-    <w:lsdException w:name="List Table 5 Dark Accent 2" w:uiPriority="50"/>
-    <w:lsdException w:name="List Table 6 Colorful Accent 2" w:uiPriority="51"/>
-    <w:lsdException w:name="List Table 7 Colorful Accent 2" w:uiPriority="52"/>
-    <w:lsdException w:name="List Table 1 Light Accent 3" w:uiPriority="46"/>
-    <w:lsdException w:name="List Table 2 Accent 3" w:uiPriority="47"/>
-    <w:lsdException w:name="List Table 3 Accent 3" w:uiPriority="48"/>
-    <w:lsdException w:name="List Table 4 Accent 3" w:uiPriority="49"/>
-    <w:lsdException w:name="List Table 5 Dark Accent 3" w:uiPriority="50"/>
-    <w:lsdException w:name="List Table 6 Colorful Accent 3" w:uiPriority="51"/>
-    <w:lsdException w:name="List Table 7 Colorful Accent 3" w:uiPriority="52"/>
-    <w:lsdException w:name="List Table 1 Light Accent 4" w:uiPriority="46"/>
-    <w:lsdException w:name="List Table 2 Accent 4" w:uiPriority="47"/>
-    <w:lsdException w:name="List Table 3 Accent 4" w:uiPriority="48"/>
-    <w:lsdException w:name="List Table 4 Accent 4" w:uiPriority="49"/>
-    <w:lsdException w:name="List Table 5 Dark Accent 4" w:uiPriority="50"/>
-    <w:lsdException w:name="List Table 6 Colorful Accent 4" w:uiPriority="51"/>
-    <w:lsdException w:name="List Table 7 Colorful Accent 4" w:uiPriority="52"/>
-    <w:lsdException w:name="List Table 1 Light Accent 5" w:uiPriority="46"/>
-    <w:lsdException w:name="List Table 2 Accent 5" w:uiPriority="47"/>
-    <w:lsdException w:name="List Table 3 Accent 5" w:uiPriority="48"/>
-    <w:lsdException w:name="List Table 4 Accent 5" w:uiPriority="49"/>
-    <w:lsdException w:name="List Table 5 Dark Accent 5" w:uiPriority="50"/>
-    <w:lsdException w:name="List Table 6 Colorful Accent 5" w:uiPriority="51"/>
-    <w:lsdException w:name="List Table 7 Colorful Accent 5" w:uiPriority="52"/>
-    <w:lsdException w:name="List Table 1 Light Accent 6" w:uiPriority="46"/>
-    <w:lsdException w:name="List Table 2 Accent 6" w:uiPriority="47"/>
-    <w:lsdException w:name="List Table 3 Accent 6" w:uiPriority="48"/>
-    <w:lsdException w:name="List Table 4 Accent 6" w:uiPriority="49"/>
-    <w:lsdException w:name="List Table 5 Dark Accent 6" w:uiPriority="50"/>
-    <w:lsdException w:name="List Table 6 Colorful Accent 6" w:uiPriority="51"/>
-    <w:lsdException w:name="List Table 7 Colorful Accent 6" w:uiPriority="52"/>
-  </w:latentStyles>
-  <w:style w:type="paragraph" w:default="1" w:styleId="Normal">
-    <w:name w:val="Normal"/>
-    <w:qFormat/>
-  </w:style>
-  <w:style w:type="character" w:default="1" w:styleId="Fuentedeprrafopredeter">
-    <w:name w:val="Default Paragraph Font"/>
-    <w:uiPriority w:val="1"/>
-    <w:semiHidden/>
-    <w:unhideWhenUsed/>
-  </w:style>
-  <w:style w:type="table" w:default="1" w:styleId="Tablanormal">
-    <w:name w:val="Normal Table"/>
-    <w:uiPriority w:val="99"/>
-    <w:semiHidden/>
-    <w:unhideWhenUsed/>
-    <w:tblPr>
-      <w:tblInd w:w="0" w:type="dxa"/>
-      <w:tblCellMar>
-        <w:top w:w="0" w:type="dxa"/>
-        <w:left w:w="108" w:type="dxa"/>
-        <w:bottom w:w="0" w:type="dxa"/>
-        <w:right w:w="108" w:type="dxa"/>
-      </w:tblCellMar>
-    </w:tblPr>
-  </w:style>
-  <w:style w:type="numbering" w:default="1" w:styleId="Sinlista">
-    <w:name w:val="No List"/>
-    <w:uiPriority w:val="99"/>
-    <w:semiHidden/>
-    <w:unhideWhenUsed/>
-  </w:style>
-</w:styles>
-</file>
-
-<file path=word/glossary/webSettings.xml><?xml version="1.0" encoding="utf-8"?>
-<w:webSettings xmlns:mc="http://schemas.openxmlformats.org/markup-compatibility/2006" xmlns:r="http://schemas.openxmlformats.org/officeDocument/2006/relationships" xmlns:w="http://schemas.openxmlformats.org/wordprocessingml/2006/main" xmlns:w14="http://schemas.microsoft.com/office/word/2010/wordml" xmlns:w15="http://schemas.microsoft.com/office/word/2012/wordml" xmlns:w16se="http://schemas.microsoft.com/office/word/2015/wordml/symex" mc:Ignorable="w14 w15 w16se"/>
 </file>
 
 <file path=word/theme/theme1.xml><?xml version="1.0" encoding="utf-8"?>
@@ -9000,6 +8718,12 @@
 </file>
 
 <file path=customXml/item1.xml><?xml version="1.0" encoding="utf-8"?>
+<p:properties xmlns:p="http://schemas.microsoft.com/office/2006/metadata/properties" xmlns:xsi="http://www.w3.org/2001/XMLSchema-instance" xmlns:pc="http://schemas.microsoft.com/office/infopath/2007/PartnerControls">
+  <documentManagement/>
+</p:properties>
+</file>
+
+<file path=customXml/item2.xml><?xml version="1.0" encoding="utf-8"?>
 <ct:contentTypeSchema xmlns:ct="http://schemas.microsoft.com/office/2006/metadata/contentType" xmlns:ma="http://schemas.microsoft.com/office/2006/metadata/properties/metaAttributes" ct:_="" ma:_="" ma:contentTypeName="Documento" ma:contentTypeID="0x010100E96778489EE7714D8BD12CC105EB918B" ma:contentTypeVersion="2" ma:contentTypeDescription="Crear nuevo documento." ma:contentTypeScope="" ma:versionID="416c5c7ae9b5d54d83875cd3c65194e3">
   <xsd:schema xmlns:xsd="http://www.w3.org/2001/XMLSchema" xmlns:xs="http://www.w3.org/2001/XMLSchema" xmlns:p="http://schemas.microsoft.com/office/2006/metadata/properties" xmlns:ns2="126e8a1c-9ea9-435a-ac89-d06c80d62e30" targetNamespace="http://schemas.microsoft.com/office/2006/metadata/properties" ma:root="true" ma:fieldsID="70a237c842677bd850644f8595079f5e" ns2:_="">
     <xsd:import namespace="126e8a1c-9ea9-435a-ac89-d06c80d62e30"/>
@@ -9131,13 +8855,11 @@
 </ct:contentTypeSchema>
 </file>
 
-<file path=customXml/item2.xml><?xml version="1.0" encoding="utf-8"?>
-<p:properties xmlns:p="http://schemas.microsoft.com/office/2006/metadata/properties" xmlns:xsi="http://www.w3.org/2001/XMLSchema-instance" xmlns:pc="http://schemas.microsoft.com/office/infopath/2007/PartnerControls">
-  <documentManagement/>
-</p:properties>
+<file path=customXml/item3.xml><?xml version="1.0" encoding="utf-8"?>
+<b:Sources xmlns:b="http://schemas.openxmlformats.org/officeDocument/2006/bibliography" xmlns="http://schemas.openxmlformats.org/officeDocument/2006/bibliography" SelectedStyle="\APASixthEditionOfficeOnline.xsl" StyleName="APA" Version="6"/>
 </file>
 
-<file path=customXml/item3.xml><?xml version="1.0" encoding="utf-8"?>
+<file path=customXml/item4.xml><?xml version="1.0" encoding="utf-8"?>
 <?mso-contentType ?>
 <FormTemplates xmlns="http://schemas.microsoft.com/sharepoint/v3/contenttype/forms">
   <Display>DocumentLibraryForm</Display>
@@ -9146,11 +8868,16 @@
 </FormTemplates>
 </file>
 
-<file path=customXml/item4.xml><?xml version="1.0" encoding="utf-8"?>
-<b:Sources xmlns:b="http://schemas.openxmlformats.org/officeDocument/2006/bibliography" xmlns="http://schemas.openxmlformats.org/officeDocument/2006/bibliography" SelectedStyle="\APASixthEditionOfficeOnline.xsl" StyleName="APA" Version="6"/>
+<file path=customXml/itemProps1.xml><?xml version="1.0" encoding="utf-8"?>
+<ds:datastoreItem xmlns:ds="http://schemas.openxmlformats.org/officeDocument/2006/customXml" ds:itemID="{5F1783E3-BA1C-4CA3-8E32-C9B378BBED03}">
+  <ds:schemaRefs>
+    <ds:schemaRef ds:uri="http://schemas.microsoft.com/office/2006/metadata/properties"/>
+    <ds:schemaRef ds:uri="http://schemas.microsoft.com/office/infopath/2007/PartnerControls"/>
+  </ds:schemaRefs>
+</ds:datastoreItem>
 </file>
 
-<file path=customXml/itemProps1.xml><?xml version="1.0" encoding="utf-8"?>
+<file path=customXml/itemProps2.xml><?xml version="1.0" encoding="utf-8"?>
 <ds:datastoreItem xmlns:ds="http://schemas.openxmlformats.org/officeDocument/2006/customXml" ds:itemID="{DF0582E6-0C2C-40A6-8E3D-E410E41021C1}">
   <ds:schemaRefs>
     <ds:schemaRef ds:uri="http://schemas.microsoft.com/office/2006/metadata/contentType"/>
@@ -9168,34 +8895,18 @@
 </ds:datastoreItem>
 </file>
 
-<file path=customXml/itemProps2.xml><?xml version="1.0" encoding="utf-8"?>
-<ds:datastoreItem xmlns:ds="http://schemas.openxmlformats.org/officeDocument/2006/customXml" ds:itemID="{5F1783E3-BA1C-4CA3-8E32-C9B378BBED03}">
+<file path=customXml/itemProps3.xml><?xml version="1.0" encoding="utf-8"?>
+<ds:datastoreItem xmlns:ds="http://schemas.openxmlformats.org/officeDocument/2006/customXml" ds:itemID="{FBD61725-A60E-40F3-AB5D-0E7F797DD77D}">
   <ds:schemaRefs>
-    <ds:schemaRef ds:uri="http://schemas.openxmlformats.org/package/2006/metadata/core-properties"/>
-    <ds:schemaRef ds:uri="http://schemas.microsoft.com/office/infopath/2007/PartnerControls"/>
-    <ds:schemaRef ds:uri="http://purl.org/dc/elements/1.1/"/>
-    <ds:schemaRef ds:uri="http://schemas.microsoft.com/office/2006/documentManagement/types"/>
-    <ds:schemaRef ds:uri="http://schemas.microsoft.com/office/2006/metadata/properties"/>
-    <ds:schemaRef ds:uri="126e8a1c-9ea9-435a-ac89-d06c80d62e30"/>
-    <ds:schemaRef ds:uri="http://purl.org/dc/terms/"/>
-    <ds:schemaRef ds:uri="http://purl.org/dc/dcmitype/"/>
-    <ds:schemaRef ds:uri="http://www.w3.org/XML/1998/namespace"/>
+    <ds:schemaRef ds:uri="http://schemas.openxmlformats.org/officeDocument/2006/bibliography"/>
   </ds:schemaRefs>
 </ds:datastoreItem>
 </file>
 
-<file path=customXml/itemProps3.xml><?xml version="1.0" encoding="utf-8"?>
+<file path=customXml/itemProps4.xml><?xml version="1.0" encoding="utf-8"?>
 <ds:datastoreItem xmlns:ds="http://schemas.openxmlformats.org/officeDocument/2006/customXml" ds:itemID="{DABAA964-10BA-4DBC-ABF2-CDEAC0FAF7AA}">
   <ds:schemaRefs>
     <ds:schemaRef ds:uri="http://schemas.microsoft.com/sharepoint/v3/contenttype/forms"/>
   </ds:schemaRefs>
 </ds:datastoreItem>
-</file>
-
-<file path=customXml/itemProps4.xml><?xml version="1.0" encoding="utf-8"?>
-<ds:datastoreItem xmlns:ds="http://schemas.openxmlformats.org/officeDocument/2006/customXml" ds:itemID="{FBD61725-A60E-40F3-AB5D-0E7F797DD77D}">
-  <ds:schemaRefs>
-    <ds:schemaRef ds:uri="http://schemas.openxmlformats.org/officeDocument/2006/bibliography"/>
-  </ds:schemaRefs>
-</ds:datastoreItem>
 </file>
</xml_diff>